<commit_message>
Snapshot research and paper workspace before ghost concat fusion
</commit_message>
<xml_diff>
--- a/docs/TopoForesight_TASE_初稿骨架.docx
+++ b/docs/TopoForesight_TASE_初稿骨架.docx
@@ -4,7 +4,7 @@
   <w:body>
     <w:p>
       <w:pPr>
-        <w:pStyle w:val="31"/>
+        <w:pStyle w:val="32"/>
         <w:keepNext/>
         <w:jc w:val="center"/>
         <w:rPr>
@@ -251,8 +251,6 @@
         </w:rPr>
         <w:t>II. 相关工作</w:t>
       </w:r>
-      <w:bookmarkStart w:id="0" w:name="_GoBack"/>
-      <w:bookmarkEnd w:id="0"/>
     </w:p>
     <w:p>
       <w:pPr>
@@ -262,51 +260,143 @@
         <w:rPr>
           <w:rFonts w:ascii="Calibri" w:hAnsi="Calibri" w:eastAsia="宋体" w:cs="Calibri"/>
         </w:rPr>
-        <w:t>A. 连续环境视觉语言导航与拓扑规划</w:t>
-      </w:r>
-    </w:p>
-    <w:p>
-      <w:r>
-        <w:rPr>
-          <w:rFonts w:ascii="Calibri" w:hAnsi="Calibri" w:eastAsia="宋体" w:cs="Calibri"/>
-        </w:rPr>
-        <w:t>本小节回顾R2R-CE、RxR-CE、图式导航和在线拓扑规划。重点说明拓扑图擅长组织历史、压缩动作空间和支持长程规划，但候选ghost的未来证据仍不充分。</w:t>
-      </w:r>
-      <w:r>
-        <w:rPr>
-          <w:rFonts w:ascii="Calibri" w:hAnsi="Calibri" w:eastAsia="宋体" w:cs="Calibri"/>
-          <w:i/>
-          <w:color w:val="9B1C1C"/>
-        </w:rPr>
-        <w:t>【待补引用：VLN-CE、ETPNav、ETP-R1、其他图式方法】</w:t>
-      </w:r>
-    </w:p>
-    <w:p>
-      <w:r>
-        <w:rPr>
-          <w:rFonts w:ascii="Calibri" w:hAnsi="Calibri" w:eastAsia="宋体" w:cs="Calibri"/>
-        </w:rPr>
-        <w:t>结尾过渡句建议：</w:t>
+        <w:t>A. 连续环境视觉语言导航与在线拓扑规划</w:t>
+      </w:r>
+    </w:p>
+    <w:p>
+      <w:r>
+        <w:rPr>
+          <w:rFonts w:ascii="Calibri" w:hAnsi="Calibri" w:eastAsia="宋体" w:cs="Calibri"/>
+        </w:rPr>
+        <w:t>VLN要求智能体在视觉观测中理解自然语言指令，并在未见环境中到达目标位置。R2R 将这一问题建立在真实室内全景图上[1]，RxR 进一步扩展多语言和密集时空标注[3]。连续环境视觉语言导航（VLN-CE）取消预定义导航图与离散节点跳转，使智能体需要在在线感知、空间记忆和低层控制之间完成闭环决策[2]。因此，如何把自然语言中的高层意图转化为可执行的中间目标，成为连续场景中导航系统设计的核心问题之一。</w:t>
+      </w:r>
+    </w:p>
+    <w:p>
+      <w:r>
+        <w:rPr>
+          <w:rFonts w:ascii="Calibri" w:hAnsi="Calibri" w:eastAsia="宋体" w:cs="Calibri"/>
+        </w:rPr>
+        <w:t>围绕这一问题，一类工作通过航点和拓扑结构压缩动作空间。Waypoint Models 研究语言条件航点预测对连续导航成功率和执行效率的影响[13]，CWP 进一步利用预测候选航点把离散 VLN 智能体迁移到连续环境[6]。在此基础上，ETPNav 将已访问位置和候选 ghost 组织为在线演化的拓扑图，并把图上规划与避障控制结合起来[7]；BEVBert 和 GridMM 分别从多模态地图预训练和栅格记忆角度增强空间表示[14], [15]；ETP-R1 通过联合预训练、在线监督微调和 GRPO 强化微调提升图式策略[9]；DGNav 则进一步关注在线拓扑图的粒度和连接关系自适应[10]。</w:t>
+      </w:r>
+    </w:p>
+    <w:p>
+      <w:r>
+        <w:rPr>
+          <w:rFonts w:ascii="Calibri" w:hAnsi="Calibri" w:eastAsia="宋体" w:cs="Calibri"/>
+        </w:rPr>
+        <w:t>与此同时，近期大模型导航方法尝试利用语言模型或视觉语言模型进行显式推理、地图提示和视频历史动作预测，如 NavGPT、MapGPT、NavGPT-2 和 NaVid[24]–[27]。这些方法展示了开放语义理解和推理能力，但连续导航仍需要稳定的空间记忆与动作接口。本文沿用在线拓扑策略的结构化决策形式，进一步关注如何为拓扑候选补充与动作直接对齐的未来证据。</w:t>
       </w:r>
     </w:p>
     <w:p>
       <w:pPr>
-        <w:pBdr>
-          <w:top w:val="single" w:color="AEB8C2" w:sz="4" w:space="4"/>
-          <w:left w:val="single" w:color="AEB8C2" w:sz="4" w:space="4"/>
-          <w:bottom w:val="single" w:color="AEB8C2" w:sz="4" w:space="4"/>
-          <w:right w:val="single" w:color="AEB8C2" w:sz="4" w:space="4"/>
-        </w:pBdr>
-        <w:shd w:val="clear" w:fill="F4F6F9"/>
-        <w:spacing w:before="100" w:after="140"/>
-        <w:ind w:left="259" w:right="115"/>
+        <w:pStyle w:val="4"/>
+        <w:rPr>
+          <w:rFonts w:hint="eastAsia" w:eastAsia="宋体"/>
+          <w:lang w:eastAsia="zh-CN"/>
+        </w:rPr>
       </w:pPr>
       <w:r>
         <w:rPr>
           <w:rFonts w:ascii="Calibri" w:hAnsi="Calibri" w:eastAsia="宋体" w:cs="Calibri"/>
-          <w:i/>
-        </w:rPr>
-        <w:t>与主要增强历史记忆或图结构的方法不同，本文关注尚未访问候选的未来状态，并将预测结果直接对齐到在线ghost动作空间。</w:t>
+        </w:rPr>
+        <w:t>B. 世界模型</w:t>
+      </w:r>
+      <w:r>
+        <w:rPr>
+          <w:rFonts w:hint="eastAsia" w:ascii="Calibri" w:hAnsi="Calibri" w:eastAsia="宋体" w:cs="Calibri"/>
+          <w:lang w:eastAsia="zh-CN"/>
+        </w:rPr>
+        <w:t>与导航前瞻</w:t>
+      </w:r>
+    </w:p>
+    <w:p>
+      <w:r>
+        <w:rPr>
+          <w:rFonts w:ascii="Calibri" w:hAnsi="Calibri" w:eastAsia="宋体" w:cs="Calibri"/>
+        </w:rPr>
+        <w:t>未来预测是缓解部分可观测性的自然途径。早期视觉表征如 CLIP 通过图文对比学习提供通用语义特征[17]，DINOv2 以大规模自监督训练获得更稳健的图像级和像素级表示[18]；表征自动编码器进一步说明，冻结的高维语义编码器可以与生成模型结合，在语义丰富的潜在空间中进行重建或生成[19]。这些视觉表征为在像素图像之外预测未来状态提供了基础。</w:t>
+      </w:r>
+    </w:p>
+    <w:p>
+      <w:r>
+        <w:rPr>
+          <w:rFonts w:ascii="Calibri" w:hAnsi="Calibri" w:eastAsia="宋体" w:cs="Calibri"/>
+        </w:rPr>
+        <w:t>在导航侧，Dreamwalker 通过生成未来全景图像</w:t>
+      </w:r>
+      <w:bookmarkStart w:id="0" w:name="_GoBack"/>
+      <w:bookmarkEnd w:id="0"/>
+      <w:r>
+        <w:rPr>
+          <w:rFonts w:ascii="Calibri" w:hAnsi="Calibri" w:eastAsia="宋体" w:cs="Calibri"/>
+        </w:rPr>
+        <w:t>并进行心理规划，为连续 VLN 引入未来想象[11]；HNR 采用层次神经辐射表示预测候选未来环境的多层语义特征，并构建未来路径树进行并行评估[8]；NavMorph 则利用自演化世界模型和短视野想象规划，在 VLN-CE 中显式研究潜在未来状态对导航决策的作用[12]。这些工作表明，预测未来环境并将其用于导航决策已经成为连续导航中的重要方向。</w:t>
+      </w:r>
+    </w:p>
+    <w:p>
+      <w:r>
+        <w:rPr>
+          <w:rFonts w:ascii="Calibri" w:hAnsi="Calibri" w:eastAsia="宋体" w:cs="Calibri"/>
+        </w:rPr>
+        <w:t>与上述工作相比，PILOT 更强调未来表征进入在线拓扑动作空间的方式。该方法不生成完整视频，也不把世界模型作为独立规划器，而是把未来视觉表征对齐到具体 ghost 候选，并通过由广到深的两级前瞻，使未来信息先参与候选表示，再进入少量关键候选的比较。这种设计使世界模型证据能够服务于在线拓扑策略的候选排序，同时保留基础策略的动作接口。</w:t>
+      </w:r>
+    </w:p>
+    <w:p>
+      <w:pPr>
+        <w:pStyle w:val="4"/>
+        <w:rPr>
+          <w:rFonts w:hint="eastAsia" w:ascii="Calibri" w:hAnsi="Calibri" w:eastAsia="宋体" w:cs="Calibri"/>
+          <w:lang w:eastAsia="zh-CN"/>
+        </w:rPr>
+      </w:pPr>
+      <w:r>
+        <w:rPr>
+          <w:rFonts w:hint="eastAsia" w:ascii="Calibri" w:hAnsi="Calibri" w:eastAsia="宋体" w:cs="Calibri"/>
+          <w:lang w:eastAsia="zh-CN"/>
+        </w:rPr>
+        <w:t xml:space="preserve">C. </w:t>
+      </w:r>
+      <w:r>
+        <w:rPr>
+          <w:rFonts w:hint="eastAsia" w:ascii="Calibri" w:hAnsi="Calibri" w:eastAsia="宋体" w:cs="Calibri"/>
+          <w:lang w:val="en-US" w:eastAsia="zh-CN"/>
+        </w:rPr>
+        <w:t>面向候选决策的高效前瞻计算</w:t>
+      </w:r>
+    </w:p>
+    <w:p>
+      <w:pPr>
+        <w:pStyle w:val="30"/>
+        <w:keepNext w:val="0"/>
+        <w:keepLines w:val="0"/>
+        <w:widowControl/>
+        <w:suppressLineNumbers w:val="0"/>
+      </w:pPr>
+      <w:r>
+        <w:t>世界模型前瞻能够为导航提供额外的未来信息，但其收益往往伴随更高的推理成本和误差传播风险。尤其在连续环境中，智能体需要在每个高层决策点处理多个候选方向；如果对所有候选都执行相同深度的未来预测，额外计算很容易超过导航策略本身的开销。动态神经网络和自适应推理研究表明，模型可以根据输入状态分配不同计算预算，在精度、延迟和资源消耗之间取得更好的权衡[16]。这一思想对于导航前瞻同样重要：深层预测不应被视为固定流程，而应优先服务于可能改变动作选择的关键候选。</w:t>
+      </w:r>
+    </w:p>
+    <w:p>
+      <w:pPr>
+        <w:pStyle w:val="30"/>
+        <w:keepNext w:val="0"/>
+        <w:keepLines w:val="0"/>
+        <w:widowControl/>
+        <w:suppressLineNumbers w:val="0"/>
+      </w:pPr>
+      <w:r>
+        <w:t>已有导航前瞻方法通常更关注未来信息的表达能力，例如生成未来图像、构建未来路径树或维护潜在状态记忆[8], [11], [12]。相比之下，PILOT 更关注前瞻信息如何以较低成本进入在线拓扑决策。具体而言，PILOT 将少步世界模型推理、决策边界附近的选择性触发和两级候选缓存复用结合起来，使未来表征主要作用于可能影响候选排序的状态。这样，前瞻模块不只是增加信息来源，也直接服务于导航性能与推理效率之间的平衡。</w:t>
+      </w:r>
+    </w:p>
+    <w:p>
+      <w:pPr>
+        <w:pStyle w:val="3"/>
+      </w:pPr>
+      <w:r>
+        <w:rPr>
+          <w:rFonts w:ascii="Calibri" w:hAnsi="Calibri" w:eastAsia="宋体" w:cs="Calibri"/>
+        </w:rPr>
+        <w:t>III. 问题定义与基础策略</w:t>
       </w:r>
     </w:p>
     <w:p>
@@ -317,23 +407,62 @@
         <w:rPr>
           <w:rFonts w:ascii="Calibri" w:hAnsi="Calibri" w:eastAsia="宋体" w:cs="Calibri"/>
         </w:rPr>
-        <w:t>B. 世界模型与导航前瞻</w:t>
-      </w:r>
-    </w:p>
-    <w:p>
-      <w:r>
-        <w:rPr>
-          <w:rFonts w:ascii="Calibri" w:hAnsi="Calibri" w:eastAsia="宋体" w:cs="Calibri"/>
-        </w:rPr>
-        <w:t>本小节回顾潜在世界模型、表征世界模型、Dreamwalker、Lookahead Exploration、NavMorph及相邻导航前瞻工作。【待补引用】</w:t>
-      </w:r>
-    </w:p>
-    <w:p>
-      <w:r>
-        <w:rPr>
-          <w:rFonts w:ascii="Calibri" w:hAnsi="Calibri" w:eastAsia="宋体" w:cs="Calibri"/>
-        </w:rPr>
-        <w:t>需要公平说明：</w:t>
+        <w:t>A. VLN-CE任务定义</w:t>
+      </w:r>
+    </w:p>
+    <w:p>
+      <w:r>
+        <w:rPr>
+          <w:rFonts w:ascii="Calibri" w:hAnsi="Calibri" w:eastAsia="宋体" w:cs="Calibri"/>
+        </w:rPr>
+        <w:t xml:space="preserve">给定自然语言指令 </w:t>
+      </w:r>
+      <w:r>
+        <w:rPr>
+          <w:rFonts w:ascii="Cambria Math" w:hAnsi="Cambria Math" w:eastAsia="Cambria Math" w:cs="Cambria Math"/>
+          <w:i/>
+        </w:rPr>
+        <w:t>I=(w_1,…,w_L)</w:t>
+      </w:r>
+      <w:r>
+        <w:rPr>
+          <w:rFonts w:ascii="Calibri" w:hAnsi="Calibri" w:eastAsia="宋体" w:cs="Calibri"/>
+        </w:rPr>
+        <w:t xml:space="preserve">、初始位姿和连续环境，智能体在时刻 </w:t>
+      </w:r>
+      <w:r>
+        <w:rPr>
+          <w:rFonts w:ascii="Cambria Math" w:hAnsi="Cambria Math" w:eastAsia="Cambria Math" w:cs="Cambria Math"/>
+          <w:i/>
+        </w:rPr>
+        <w:t>t</w:t>
+      </w:r>
+      <w:r>
+        <w:rPr>
+          <w:rFonts w:ascii="Calibri" w:hAnsi="Calibri" w:eastAsia="宋体" w:cs="Calibri"/>
+        </w:rPr>
+        <w:t xml:space="preserve"> 接收RGB-D观测 </w:t>
+      </w:r>
+      <w:r>
+        <w:rPr>
+          <w:rFonts w:ascii="Cambria Math" w:hAnsi="Cambria Math" w:eastAsia="Cambria Math" w:cs="Cambria Math"/>
+          <w:i/>
+        </w:rPr>
+        <w:t>o_t</w:t>
+      </w:r>
+      <w:r>
+        <w:rPr>
+          <w:rFonts w:ascii="Calibri" w:hAnsi="Calibri" w:eastAsia="宋体" w:cs="Calibri"/>
+        </w:rPr>
+        <w:t>，并选择高层拓扑动作和底层运动动作。目标是在有限步数内停止于目标区域，同时尽量缩短路径并避免碰撞。</w:t>
+      </w:r>
+    </w:p>
+    <w:p>
+      <w:r>
+        <w:rPr>
+          <w:rFonts w:ascii="Calibri" w:hAnsi="Calibri" w:eastAsia="宋体" w:cs="Calibri"/>
+        </w:rPr>
+        <w:t>在此定义：</w:t>
       </w:r>
     </w:p>
     <w:p>
@@ -344,7 +473,33 @@
         <w:rPr>
           <w:rFonts w:ascii="Calibri" w:hAnsi="Calibri" w:eastAsia="宋体" w:cs="Calibri"/>
         </w:rPr>
-        <w:t>本文不声称首次将世界模型用于VLN或VLN-CE。</w:t>
+        <w:t>观测历史：</w:t>
+      </w:r>
+      <w:r>
+        <w:rPr>
+          <w:rFonts w:ascii="Cambria Math" w:hAnsi="Cambria Math" w:eastAsia="Cambria Math" w:cs="Cambria Math"/>
+          <w:i/>
+        </w:rPr>
+        <w:t>H_t=\(o_t-c+1,…,o_t\)</w:t>
+      </w:r>
+      <w:r>
+        <w:rPr>
+          <w:rFonts w:ascii="Calibri" w:hAnsi="Calibri" w:eastAsia="宋体" w:cs="Calibri"/>
+        </w:rPr>
+        <w:t xml:space="preserve">，其中上下文长度为 </w:t>
+      </w:r>
+      <w:r>
+        <w:rPr>
+          <w:rFonts w:ascii="Cambria Math" w:hAnsi="Cambria Math" w:eastAsia="Cambria Math" w:cs="Cambria Math"/>
+          <w:i/>
+        </w:rPr>
+        <w:t>c</w:t>
+      </w:r>
+      <w:r>
+        <w:rPr>
+          <w:rFonts w:ascii="Calibri" w:hAnsi="Calibri" w:eastAsia="宋体" w:cs="Calibri"/>
+        </w:rPr>
+        <w:t>；</w:t>
       </w:r>
     </w:p>
     <w:p>
@@ -355,7 +510,20 @@
         <w:rPr>
           <w:rFonts w:ascii="Calibri" w:hAnsi="Calibri" w:eastAsia="宋体" w:cs="Calibri"/>
         </w:rPr>
-        <w:t>本文不重新训练或提出世界模型本体。</w:t>
+        <w:t>在线拓扑图：</w:t>
+      </w:r>
+      <w:r>
+        <w:rPr>
+          <w:rFonts w:ascii="Cambria Math" w:hAnsi="Cambria Math" w:eastAsia="Cambria Math" w:cs="Cambria Math"/>
+          <w:i/>
+        </w:rPr>
+        <w:t>G_t=(V_t,E_t)</w:t>
+      </w:r>
+      <w:r>
+        <w:rPr>
+          <w:rFonts w:ascii="Calibri" w:hAnsi="Calibri" w:eastAsia="宋体" w:cs="Calibri"/>
+        </w:rPr>
+        <w:t>；</w:t>
       </w:r>
     </w:p>
     <w:p>
@@ -366,20 +534,92 @@
         <w:rPr>
           <w:rFonts w:ascii="Calibri" w:hAnsi="Calibri" w:eastAsia="宋体" w:cs="Calibri"/>
         </w:rPr>
-        <w:t xml:space="preserve">本文区别在于双阶段ghost对齐、预测状态驱动查询、终端 </w:t>
+        <w:t>已访问节点集合：</w:t>
       </w:r>
       <w:r>
         <w:rPr>
           <w:rFonts w:ascii="Cambria Math" w:hAnsi="Cambria Math" w:eastAsia="Cambria Math" w:cs="Cambria Math"/>
           <w:i/>
         </w:rPr>
-        <w:t>q_k</w:t>
-      </w:r>
-      <w:r>
-        <w:rPr>
-          <w:rFonts w:ascii="Calibri" w:hAnsi="Calibri" w:eastAsia="宋体" w:cs="Calibri"/>
-        </w:rPr>
-        <w:t xml:space="preserve"> 候选证据和有界干预。</w:t>
+        <w:t>V_t^vis</w:t>
+      </w:r>
+      <w:r>
+        <w:rPr>
+          <w:rFonts w:ascii="Calibri" w:hAnsi="Calibri" w:eastAsia="宋体" w:cs="Calibri"/>
+        </w:rPr>
+        <w:t>；</w:t>
+      </w:r>
+    </w:p>
+    <w:p>
+      <w:pPr>
+        <w:pStyle w:val="16"/>
+      </w:pPr>
+      <w:r>
+        <w:rPr>
+          <w:rFonts w:ascii="Calibri" w:hAnsi="Calibri" w:eastAsia="宋体" w:cs="Calibri"/>
+        </w:rPr>
+        <w:t>尚未访问的ghost候选集合：</w:t>
+      </w:r>
+      <w:r>
+        <w:rPr>
+          <w:rFonts w:ascii="Cambria Math" w:hAnsi="Cambria Math" w:eastAsia="Cambria Math" w:cs="Cambria Math"/>
+          <w:i/>
+        </w:rPr>
+        <w:t>V_t^ghost</w:t>
+      </w:r>
+      <w:r>
+        <w:rPr>
+          <w:rFonts w:ascii="Calibri" w:hAnsi="Calibri" w:eastAsia="宋体" w:cs="Calibri"/>
+        </w:rPr>
+        <w:t>；</w:t>
+      </w:r>
+    </w:p>
+    <w:p>
+      <w:pPr>
+        <w:pStyle w:val="16"/>
+      </w:pPr>
+      <w:r>
+        <w:rPr>
+          <w:rFonts w:ascii="Calibri" w:hAnsi="Calibri" w:eastAsia="宋体" w:cs="Calibri"/>
+        </w:rPr>
+        <w:t>基础策略分数：</w:t>
+      </w:r>
+      <w:r>
+        <w:rPr>
+          <w:rFonts w:ascii="Cambria Math" w:hAnsi="Cambria Math" w:eastAsia="Cambria Math" w:cs="Cambria Math"/>
+          <w:i/>
+        </w:rPr>
+        <w:t>s_t,i</w:t>
+      </w:r>
+      <w:r>
+        <w:rPr>
+          <w:rFonts w:ascii="Calibri" w:hAnsi="Calibri" w:eastAsia="宋体" w:cs="Calibri"/>
+        </w:rPr>
+        <w:t>；</w:t>
+      </w:r>
+    </w:p>
+    <w:p>
+      <w:pPr>
+        <w:pStyle w:val="16"/>
+      </w:pPr>
+      <w:r>
+        <w:rPr>
+          <w:rFonts w:ascii="Calibri" w:hAnsi="Calibri" w:eastAsia="宋体" w:cs="Calibri"/>
+        </w:rPr>
+        <w:t>最终动作分布：</w:t>
+      </w:r>
+      <w:r>
+        <w:rPr>
+          <w:rFonts w:ascii="Cambria Math" w:hAnsi="Cambria Math" w:eastAsia="Cambria Math" w:cs="Cambria Math"/>
+          <w:i/>
+        </w:rPr>
+        <w:t>π(a_t| I,H_t,G_t)</w:t>
+      </w:r>
+      <w:r>
+        <w:rPr>
+          <w:rFonts w:ascii="Calibri" w:hAnsi="Calibri" w:eastAsia="宋体" w:cs="Calibri"/>
+        </w:rPr>
+        <w:t>。</w:t>
       </w:r>
     </w:p>
     <w:p>
@@ -390,42 +630,67 @@
         <w:rPr>
           <w:rFonts w:ascii="Calibri" w:hAnsi="Calibri" w:eastAsia="宋体" w:cs="Calibri"/>
         </w:rPr>
-        <w:t>C. 计算自适应推理与强化微调</w:t>
-      </w:r>
-    </w:p>
-    <w:p>
-      <w:r>
-        <w:rPr>
-          <w:rFonts w:ascii="Calibri" w:hAnsi="Calibri" w:eastAsia="宋体" w:cs="Calibri"/>
-        </w:rPr>
-        <w:t>本小节回顾选择性计算、早退、动态推理预算、基于置信度的触发，以及VLN中的SFT、PPO和GRPO。</w:t>
-      </w:r>
-      <w:r>
-        <w:rPr>
-          <w:rFonts w:ascii="Calibri" w:hAnsi="Calibri" w:eastAsia="宋体" w:cs="Calibri"/>
-          <w:i/>
-          <w:color w:val="9B1C1C"/>
-        </w:rPr>
-        <w:t>【待补引用：动态推理、DeepSeekMath/GRPO、ETP-R1、NavGRPO】</w:t>
-      </w:r>
-    </w:p>
-    <w:p>
-      <w:r>
-        <w:rPr>
-          <w:rFonts w:ascii="Calibri" w:hAnsi="Calibri" w:eastAsia="宋体" w:cs="Calibri"/>
-        </w:rPr>
-        <w:t>结尾强调：本文的决策不变性触发不同于经验置信度阈值，它利用候选残差的确定上界判断深层重排是否可能改变当前赢家。</w:t>
+        <w:t>B. 在线拓扑图与候选动作</w:t>
+      </w:r>
+    </w:p>
+    <w:p>
+      <w:r>
+        <w:rPr>
+          <w:rFonts w:ascii="Calibri" w:hAnsi="Calibri" w:eastAsia="宋体" w:cs="Calibri"/>
+        </w:rPr>
+        <w:t>说明ETP-R1如何构造已访问节点、ghost节点、候选几何和STOP动作。这里只保留理解新增方法所需的最小背景，旧ETP-R1的联合预训练和GRPO细节不重复包装成本文创新。</w:t>
+      </w:r>
+    </w:p>
+    <w:p>
+      <w:r>
+        <w:rPr>
+          <w:rFonts w:ascii="Calibri" w:hAnsi="Calibri" w:eastAsia="宋体" w:cs="Calibri"/>
+        </w:rPr>
+        <w:t>需要明确：</w:t>
       </w:r>
     </w:p>
     <w:p>
       <w:pPr>
-        <w:pStyle w:val="3"/>
+        <w:pStyle w:val="16"/>
       </w:pPr>
       <w:r>
         <w:rPr>
           <w:rFonts w:ascii="Calibri" w:hAnsi="Calibri" w:eastAsia="宋体" w:cs="Calibri"/>
         </w:rPr>
-        <w:t>III. 问题定义与基础策略</w:t>
+        <w:t>ghost位置采用图更新后的统一位置语义；</w:t>
+      </w:r>
+    </w:p>
+    <w:p>
+      <w:pPr>
+        <w:pStyle w:val="16"/>
+      </w:pPr>
+      <w:r>
+        <w:rPr>
+          <w:rFonts w:ascii="Calibri" w:hAnsi="Calibri" w:eastAsia="宋体" w:cs="Calibri"/>
+        </w:rPr>
+        <w:t>同一ghost被重复观测时如何聚合；</w:t>
+      </w:r>
+    </w:p>
+    <w:p>
+      <w:pPr>
+        <w:pStyle w:val="16"/>
+      </w:pPr>
+      <w:r>
+        <w:rPr>
+          <w:rFonts w:ascii="Calibri" w:hAnsi="Calibri" w:eastAsia="宋体" w:cs="Calibri"/>
+        </w:rPr>
+        <w:t>候选缓存何时更新和失效；</w:t>
+      </w:r>
+    </w:p>
+    <w:p>
+      <w:pPr>
+        <w:pStyle w:val="16"/>
+      </w:pPr>
+      <w:r>
+        <w:rPr>
+          <w:rFonts w:ascii="Calibri" w:hAnsi="Calibri" w:eastAsia="宋体" w:cs="Calibri"/>
+        </w:rPr>
+        <w:t>STOP不是移动ghost，也不接收候选残差。</w:t>
       </w:r>
     </w:p>
     <w:p>
@@ -436,373 +701,79 @@
         <w:rPr>
           <w:rFonts w:ascii="Calibri" w:hAnsi="Calibri" w:eastAsia="宋体" w:cs="Calibri"/>
         </w:rPr>
-        <w:t>A. VLN-CE任务定义</w:t>
-      </w:r>
-    </w:p>
-    <w:p>
-      <w:r>
-        <w:rPr>
-          <w:rFonts w:ascii="Calibri" w:hAnsi="Calibri" w:eastAsia="宋体" w:cs="Calibri"/>
-        </w:rPr>
-        <w:t xml:space="preserve">给定自然语言指令 </w:t>
+        <w:t xml:space="preserve">C. 统一符号：候选预算 </w:t>
       </w:r>
       <w:r>
         <w:rPr>
           <w:rFonts w:ascii="Cambria Math" w:hAnsi="Cambria Math" w:eastAsia="Cambria Math" w:cs="Cambria Math"/>
           <w:i/>
         </w:rPr>
-        <w:t>I=(w_1,…,w_L)</w:t>
-      </w:r>
-      <w:r>
-        <w:rPr>
-          <w:rFonts w:ascii="Calibri" w:hAnsi="Calibri" w:eastAsia="宋体" w:cs="Calibri"/>
-        </w:rPr>
-        <w:t xml:space="preserve">、初始位姿和连续环境，智能体在时刻 </w:t>
+        <w:t>K</w:t>
+      </w:r>
+      <w:r>
+        <w:rPr>
+          <w:rFonts w:ascii="Calibri" w:hAnsi="Calibri" w:eastAsia="宋体" w:cs="Calibri"/>
+        </w:rPr>
+        <w:t xml:space="preserve"> 与展开步数 </w:t>
       </w:r>
       <w:r>
         <w:rPr>
           <w:rFonts w:ascii="Cambria Math" w:hAnsi="Cambria Math" w:eastAsia="Cambria Math" w:cs="Cambria Math"/>
           <w:i/>
         </w:rPr>
-        <w:t>t</w:t>
-      </w:r>
-      <w:r>
-        <w:rPr>
-          <w:rFonts w:ascii="Calibri" w:hAnsi="Calibri" w:eastAsia="宋体" w:cs="Calibri"/>
-        </w:rPr>
-        <w:t xml:space="preserve"> 接收RGB-D观测 </w:t>
+        <w:t>k</w:t>
+      </w:r>
+    </w:p>
+    <w:p>
+      <w:r>
+        <w:rPr>
+          <w:rFonts w:ascii="Calibri" w:hAnsi="Calibri" w:eastAsia="宋体" w:cs="Calibri"/>
+        </w:rPr>
+        <w:t xml:space="preserve">大写 </w:t>
       </w:r>
       <w:r>
         <w:rPr>
           <w:rFonts w:ascii="Cambria Math" w:hAnsi="Cambria Math" w:eastAsia="Cambria Math" w:cs="Cambria Math"/>
           <w:i/>
         </w:rPr>
-        <w:t>o_t</w:t>
-      </w:r>
-      <w:r>
-        <w:rPr>
-          <w:rFonts w:ascii="Calibri" w:hAnsi="Calibri" w:eastAsia="宋体" w:cs="Calibri"/>
-        </w:rPr>
-        <w:t>，并选择高层拓扑动作和底层运动动作。目标是在有限步数内停止于目标区域，同时尽量缩短路径并避免碰撞。</w:t>
-      </w:r>
-    </w:p>
-    <w:p>
-      <w:r>
-        <w:rPr>
-          <w:rFonts w:ascii="Calibri" w:hAnsi="Calibri" w:eastAsia="宋体" w:cs="Calibri"/>
-        </w:rPr>
-        <w:t>在此定义：</w:t>
-      </w:r>
-    </w:p>
-    <w:p>
-      <w:pPr>
-        <w:pStyle w:val="16"/>
-      </w:pPr>
-      <w:r>
-        <w:rPr>
-          <w:rFonts w:ascii="Calibri" w:hAnsi="Calibri" w:eastAsia="宋体" w:cs="Calibri"/>
-        </w:rPr>
-        <w:t>观测历史：</w:t>
+        <w:t>K</w:t>
+      </w:r>
+      <w:r>
+        <w:rPr>
+          <w:rFonts w:ascii="Calibri" w:hAnsi="Calibri" w:eastAsia="宋体" w:cs="Calibri"/>
+        </w:rPr>
+        <w:t xml:space="preserve"> 表示第二阶段深入处理的移动候选数量。小写 </w:t>
       </w:r>
       <w:r>
         <w:rPr>
           <w:rFonts w:ascii="Cambria Math" w:hAnsi="Cambria Math" w:eastAsia="Cambria Math" w:cs="Cambria Math"/>
           <w:i/>
         </w:rPr>
-        <w:t>H_t=\(o_t-c+1,…,o_t\)</w:t>
-      </w:r>
-      <w:r>
-        <w:rPr>
-          <w:rFonts w:ascii="Calibri" w:hAnsi="Calibri" w:eastAsia="宋体" w:cs="Calibri"/>
-        </w:rPr>
-        <w:t xml:space="preserve">，其中上下文长度为 </w:t>
+        <w:t>k≥1</w:t>
+      </w:r>
+      <w:r>
+        <w:rPr>
+          <w:rFonts w:ascii="Calibri" w:hAnsi="Calibri" w:eastAsia="宋体" w:cs="Calibri"/>
+        </w:rPr>
+        <w:t xml:space="preserve"> 表示从候选到达状态 </w:t>
       </w:r>
       <w:r>
         <w:rPr>
           <w:rFonts w:ascii="Cambria Math" w:hAnsi="Cambria Math" w:eastAsia="Cambria Math" w:cs="Cambria Math"/>
           <w:i/>
         </w:rPr>
-        <w:t>c</w:t>
-      </w:r>
-      <w:r>
-        <w:rPr>
-          <w:rFonts w:ascii="Calibri" w:hAnsi="Calibri" w:eastAsia="宋体" w:cs="Calibri"/>
-        </w:rPr>
-        <w:t>；</w:t>
+        <w:t>q_0</w:t>
+      </w:r>
+      <w:r>
+        <w:rPr>
+          <w:rFonts w:ascii="Calibri" w:hAnsi="Calibri" w:eastAsia="宋体" w:cs="Calibri"/>
+        </w:rPr>
+        <w:t xml:space="preserve"> 开始的空间查询展开步数：</w:t>
       </w:r>
     </w:p>
     <w:p>
       <w:pPr>
-        <w:pStyle w:val="16"/>
-      </w:pPr>
-      <w:r>
-        <w:rPr>
-          <w:rFonts w:ascii="Calibri" w:hAnsi="Calibri" w:eastAsia="宋体" w:cs="Calibri"/>
-        </w:rPr>
-        <w:t>在线拓扑图：</w:t>
-      </w:r>
-      <w:r>
-        <w:rPr>
-          <w:rFonts w:ascii="Cambria Math" w:hAnsi="Cambria Math" w:eastAsia="Cambria Math" w:cs="Cambria Math"/>
-          <w:i/>
-        </w:rPr>
-        <w:t>G_t=(V_t,E_t)</w:t>
-      </w:r>
-      <w:r>
-        <w:rPr>
-          <w:rFonts w:ascii="Calibri" w:hAnsi="Calibri" w:eastAsia="宋体" w:cs="Calibri"/>
-        </w:rPr>
-        <w:t>；</w:t>
-      </w:r>
-    </w:p>
-    <w:p>
-      <w:pPr>
-        <w:pStyle w:val="16"/>
-      </w:pPr>
-      <w:r>
-        <w:rPr>
-          <w:rFonts w:ascii="Calibri" w:hAnsi="Calibri" w:eastAsia="宋体" w:cs="Calibri"/>
-        </w:rPr>
-        <w:t>已访问节点集合：</w:t>
-      </w:r>
-      <w:r>
-        <w:rPr>
-          <w:rFonts w:ascii="Cambria Math" w:hAnsi="Cambria Math" w:eastAsia="Cambria Math" w:cs="Cambria Math"/>
-          <w:i/>
-        </w:rPr>
-        <w:t>V_t^vis</w:t>
-      </w:r>
-      <w:r>
-        <w:rPr>
-          <w:rFonts w:ascii="Calibri" w:hAnsi="Calibri" w:eastAsia="宋体" w:cs="Calibri"/>
-        </w:rPr>
-        <w:t>；</w:t>
-      </w:r>
-    </w:p>
-    <w:p>
-      <w:pPr>
-        <w:pStyle w:val="16"/>
-      </w:pPr>
-      <w:r>
-        <w:rPr>
-          <w:rFonts w:ascii="Calibri" w:hAnsi="Calibri" w:eastAsia="宋体" w:cs="Calibri"/>
-        </w:rPr>
-        <w:t>尚未访问的ghost候选集合：</w:t>
-      </w:r>
-      <w:r>
-        <w:rPr>
-          <w:rFonts w:ascii="Cambria Math" w:hAnsi="Cambria Math" w:eastAsia="Cambria Math" w:cs="Cambria Math"/>
-          <w:i/>
-        </w:rPr>
-        <w:t>V_t^ghost</w:t>
-      </w:r>
-      <w:r>
-        <w:rPr>
-          <w:rFonts w:ascii="Calibri" w:hAnsi="Calibri" w:eastAsia="宋体" w:cs="Calibri"/>
-        </w:rPr>
-        <w:t>；</w:t>
-      </w:r>
-    </w:p>
-    <w:p>
-      <w:pPr>
-        <w:pStyle w:val="16"/>
-      </w:pPr>
-      <w:r>
-        <w:rPr>
-          <w:rFonts w:ascii="Calibri" w:hAnsi="Calibri" w:eastAsia="宋体" w:cs="Calibri"/>
-        </w:rPr>
-        <w:t>基础策略分数：</w:t>
-      </w:r>
-      <w:r>
-        <w:rPr>
-          <w:rFonts w:ascii="Cambria Math" w:hAnsi="Cambria Math" w:eastAsia="Cambria Math" w:cs="Cambria Math"/>
-          <w:i/>
-        </w:rPr>
-        <w:t>s_t,i</w:t>
-      </w:r>
-      <w:r>
-        <w:rPr>
-          <w:rFonts w:ascii="Calibri" w:hAnsi="Calibri" w:eastAsia="宋体" w:cs="Calibri"/>
-        </w:rPr>
-        <w:t>；</w:t>
-      </w:r>
-    </w:p>
-    <w:p>
-      <w:pPr>
-        <w:pStyle w:val="16"/>
-      </w:pPr>
-      <w:r>
-        <w:rPr>
-          <w:rFonts w:ascii="Calibri" w:hAnsi="Calibri" w:eastAsia="宋体" w:cs="Calibri"/>
-        </w:rPr>
-        <w:t>最终动作分布：</w:t>
-      </w:r>
-      <w:r>
-        <w:rPr>
-          <w:rFonts w:ascii="Cambria Math" w:hAnsi="Cambria Math" w:eastAsia="Cambria Math" w:cs="Cambria Math"/>
-          <w:i/>
-        </w:rPr>
-        <w:t>π(a_t| I,H_t,G_t)</w:t>
-      </w:r>
-      <w:r>
-        <w:rPr>
-          <w:rFonts w:ascii="Calibri" w:hAnsi="Calibri" w:eastAsia="宋体" w:cs="Calibri"/>
-        </w:rPr>
-        <w:t>。</w:t>
-      </w:r>
-    </w:p>
-    <w:p>
-      <w:pPr>
-        <w:pStyle w:val="4"/>
-      </w:pPr>
-      <w:r>
-        <w:rPr>
-          <w:rFonts w:ascii="Calibri" w:hAnsi="Calibri" w:eastAsia="宋体" w:cs="Calibri"/>
-        </w:rPr>
-        <w:t>B. 在线拓扑图与候选动作</w:t>
-      </w:r>
-    </w:p>
-    <w:p>
-      <w:r>
-        <w:rPr>
-          <w:rFonts w:ascii="Calibri" w:hAnsi="Calibri" w:eastAsia="宋体" w:cs="Calibri"/>
-        </w:rPr>
-        <w:t>说明ETP-R1如何构造已访问节点、ghost节点、候选几何和STOP动作。这里只保留理解新增方法所需的最小背景，旧ETP-R1的联合预训练和GRPO细节不重复包装成本文创新。</w:t>
-      </w:r>
-    </w:p>
-    <w:p>
-      <w:r>
-        <w:rPr>
-          <w:rFonts w:ascii="Calibri" w:hAnsi="Calibri" w:eastAsia="宋体" w:cs="Calibri"/>
-        </w:rPr>
-        <w:t>需要明确：</w:t>
-      </w:r>
-    </w:p>
-    <w:p>
-      <w:pPr>
-        <w:pStyle w:val="16"/>
-      </w:pPr>
-      <w:r>
-        <w:rPr>
-          <w:rFonts w:ascii="Calibri" w:hAnsi="Calibri" w:eastAsia="宋体" w:cs="Calibri"/>
-        </w:rPr>
-        <w:t>ghost位置采用图更新后的统一位置语义；</w:t>
-      </w:r>
-    </w:p>
-    <w:p>
-      <w:pPr>
-        <w:pStyle w:val="16"/>
-      </w:pPr>
-      <w:r>
-        <w:rPr>
-          <w:rFonts w:ascii="Calibri" w:hAnsi="Calibri" w:eastAsia="宋体" w:cs="Calibri"/>
-        </w:rPr>
-        <w:t>同一ghost被重复观测时如何聚合；</w:t>
-      </w:r>
-    </w:p>
-    <w:p>
-      <w:pPr>
-        <w:pStyle w:val="16"/>
-      </w:pPr>
-      <w:r>
-        <w:rPr>
-          <w:rFonts w:ascii="Calibri" w:hAnsi="Calibri" w:eastAsia="宋体" w:cs="Calibri"/>
-        </w:rPr>
-        <w:t>候选缓存何时更新和失效；</w:t>
-      </w:r>
-    </w:p>
-    <w:p>
-      <w:pPr>
-        <w:pStyle w:val="16"/>
-      </w:pPr>
-      <w:r>
-        <w:rPr>
-          <w:rFonts w:ascii="Calibri" w:hAnsi="Calibri" w:eastAsia="宋体" w:cs="Calibri"/>
-        </w:rPr>
-        <w:t>STOP不是移动ghost，也不接收候选残差。</w:t>
-      </w:r>
-    </w:p>
-    <w:p>
-      <w:pPr>
-        <w:pStyle w:val="4"/>
-      </w:pPr>
-      <w:r>
-        <w:rPr>
-          <w:rFonts w:ascii="Calibri" w:hAnsi="Calibri" w:eastAsia="宋体" w:cs="Calibri"/>
-        </w:rPr>
-        <w:t xml:space="preserve">C. 统一符号：候选预算 </w:t>
-      </w:r>
-      <w:r>
-        <w:rPr>
-          <w:rFonts w:ascii="Cambria Math" w:hAnsi="Cambria Math" w:eastAsia="Cambria Math" w:cs="Cambria Math"/>
-          <w:i/>
-        </w:rPr>
-        <w:t>K</w:t>
-      </w:r>
-      <w:r>
-        <w:rPr>
-          <w:rFonts w:ascii="Calibri" w:hAnsi="Calibri" w:eastAsia="宋体" w:cs="Calibri"/>
-        </w:rPr>
-        <w:t xml:space="preserve"> 与展开步数 </w:t>
-      </w:r>
-      <w:r>
-        <w:rPr>
-          <w:rFonts w:ascii="Cambria Math" w:hAnsi="Cambria Math" w:eastAsia="Cambria Math" w:cs="Cambria Math"/>
-          <w:i/>
-        </w:rPr>
-        <w:t>k</w:t>
-      </w:r>
-    </w:p>
-    <w:p>
-      <w:r>
-        <w:rPr>
-          <w:rFonts w:ascii="Calibri" w:hAnsi="Calibri" w:eastAsia="宋体" w:cs="Calibri"/>
-        </w:rPr>
-        <w:t xml:space="preserve">大写 </w:t>
-      </w:r>
-      <w:r>
-        <w:rPr>
-          <w:rFonts w:ascii="Cambria Math" w:hAnsi="Cambria Math" w:eastAsia="Cambria Math" w:cs="Cambria Math"/>
-          <w:i/>
-        </w:rPr>
-        <w:t>K</w:t>
-      </w:r>
-      <w:r>
-        <w:rPr>
-          <w:rFonts w:ascii="Calibri" w:hAnsi="Calibri" w:eastAsia="宋体" w:cs="Calibri"/>
-        </w:rPr>
-        <w:t xml:space="preserve"> 表示第二阶段深入处理的移动候选数量。小写 </w:t>
-      </w:r>
-      <w:r>
-        <w:rPr>
-          <w:rFonts w:ascii="Cambria Math" w:hAnsi="Cambria Math" w:eastAsia="Cambria Math" w:cs="Cambria Math"/>
-          <w:i/>
-        </w:rPr>
-        <w:t>k≥1</w:t>
-      </w:r>
-      <w:r>
-        <w:rPr>
-          <w:rFonts w:ascii="Calibri" w:hAnsi="Calibri" w:eastAsia="宋体" w:cs="Calibri"/>
-        </w:rPr>
-        <w:t xml:space="preserve"> 表示从候选到达状态 </w:t>
-      </w:r>
-      <w:r>
-        <w:rPr>
-          <w:rFonts w:ascii="Cambria Math" w:hAnsi="Cambria Math" w:eastAsia="Cambria Math" w:cs="Cambria Math"/>
-          <w:i/>
-        </w:rPr>
-        <w:t>q_0</w:t>
-      </w:r>
-      <w:r>
-        <w:rPr>
-          <w:rFonts w:ascii="Calibri" w:hAnsi="Calibri" w:eastAsia="宋体" w:cs="Calibri"/>
-        </w:rPr>
-        <w:t xml:space="preserve"> 开始的空间查询展开步数：</w:t>
-      </w:r>
-    </w:p>
-    <w:p>
-      <w:pPr>
-        <w:pStyle w:val="164"/>
+        <w:pStyle w:val="165"/>
         <w:keepLines/>
         <w:jc w:val="center"/>
       </w:pPr>
@@ -987,7 +958,7 @@
     </w:p>
     <w:p>
       <w:pPr>
-        <w:pStyle w:val="164"/>
+        <w:pStyle w:val="165"/>
         <w:keepLines/>
         <w:jc w:val="center"/>
       </w:pPr>
@@ -1106,7 +1077,7 @@
     </w:p>
     <w:p>
       <w:pPr>
-        <w:pStyle w:val="164"/>
+        <w:pStyle w:val="165"/>
         <w:keepLines/>
         <w:jc w:val="center"/>
       </w:pPr>
@@ -1141,7 +1112,7 @@
     </w:p>
     <w:p>
       <w:pPr>
-        <w:pStyle w:val="164"/>
+        <w:pStyle w:val="165"/>
         <w:keepLines/>
         <w:jc w:val="center"/>
       </w:pPr>
@@ -1326,7 +1297,7 @@
     </w:p>
     <w:p>
       <w:pPr>
-        <w:pStyle w:val="164"/>
+        <w:pStyle w:val="165"/>
         <w:keepLines/>
         <w:jc w:val="center"/>
       </w:pPr>
@@ -1348,7 +1319,7 @@
     </w:p>
     <w:p>
       <w:pPr>
-        <w:pStyle w:val="164"/>
+        <w:pStyle w:val="165"/>
         <w:keepLines/>
         <w:jc w:val="center"/>
       </w:pPr>
@@ -1428,7 +1399,7 @@
     </w:p>
     <w:p>
       <w:pPr>
-        <w:pStyle w:val="164"/>
+        <w:pStyle w:val="165"/>
         <w:keepLines/>
         <w:jc w:val="center"/>
       </w:pPr>
@@ -1463,7 +1434,7 @@
     </w:p>
     <w:p>
       <w:pPr>
-        <w:pStyle w:val="164"/>
+        <w:pStyle w:val="165"/>
         <w:keepLines/>
         <w:jc w:val="center"/>
       </w:pPr>
@@ -1477,7 +1448,7 @@
     </w:p>
     <w:p>
       <w:pPr>
-        <w:pStyle w:val="164"/>
+        <w:pStyle w:val="165"/>
         <w:keepLines/>
         <w:jc w:val="center"/>
       </w:pPr>
@@ -1491,7 +1462,7 @@
     </w:p>
     <w:p>
       <w:pPr>
-        <w:pStyle w:val="164"/>
+        <w:pStyle w:val="165"/>
         <w:keepLines/>
         <w:jc w:val="center"/>
       </w:pPr>
@@ -1735,7 +1706,7 @@
     </w:p>
     <w:p>
       <w:pPr>
-        <w:pStyle w:val="164"/>
+        <w:pStyle w:val="165"/>
         <w:keepLines/>
         <w:jc w:val="center"/>
       </w:pPr>
@@ -1757,7 +1728,7 @@
     </w:p>
     <w:p>
       <w:pPr>
-        <w:pStyle w:val="164"/>
+        <w:pStyle w:val="165"/>
         <w:keepLines/>
         <w:jc w:val="center"/>
       </w:pPr>
@@ -1779,7 +1750,7 @@
     </w:p>
     <w:p>
       <w:pPr>
-        <w:pStyle w:val="164"/>
+        <w:pStyle w:val="165"/>
         <w:keepLines/>
         <w:jc w:val="center"/>
       </w:pPr>
@@ -1833,7 +1804,7 @@
     </w:p>
     <w:p>
       <w:pPr>
-        <w:pStyle w:val="164"/>
+        <w:pStyle w:val="165"/>
         <w:keepLines/>
         <w:jc w:val="center"/>
       </w:pPr>
@@ -1887,7 +1858,7 @@
     </w:p>
     <w:p>
       <w:pPr>
-        <w:pStyle w:val="164"/>
+        <w:pStyle w:val="165"/>
         <w:keepLines/>
         <w:jc w:val="center"/>
       </w:pPr>
@@ -1909,7 +1880,7 @@
     </w:p>
     <w:p>
       <w:pPr>
-        <w:pStyle w:val="164"/>
+        <w:pStyle w:val="165"/>
         <w:keepLines/>
         <w:jc w:val="center"/>
       </w:pPr>
@@ -2180,7 +2151,7 @@
     </w:p>
     <w:p>
       <w:pPr>
-        <w:pStyle w:val="164"/>
+        <w:pStyle w:val="165"/>
         <w:keepLines/>
         <w:jc w:val="center"/>
       </w:pPr>
@@ -2228,7 +2199,7 @@
     </w:p>
     <w:p>
       <w:pPr>
-        <w:pStyle w:val="164"/>
+        <w:pStyle w:val="165"/>
         <w:keepLines/>
         <w:jc w:val="center"/>
       </w:pPr>
@@ -2432,7 +2403,7 @@
     </w:p>
     <w:p>
       <w:pPr>
-        <w:pStyle w:val="164"/>
+        <w:pStyle w:val="165"/>
         <w:keepLines/>
         <w:jc w:val="center"/>
       </w:pPr>
@@ -2454,7 +2425,7 @@
     </w:p>
     <w:p>
       <w:pPr>
-        <w:pStyle w:val="164"/>
+        <w:pStyle w:val="165"/>
         <w:keepLines/>
         <w:jc w:val="center"/>
       </w:pPr>
@@ -2476,7 +2447,7 @@
     </w:p>
     <w:p>
       <w:pPr>
-        <w:pStyle w:val="164"/>
+        <w:pStyle w:val="165"/>
         <w:keepLines/>
         <w:jc w:val="center"/>
       </w:pPr>
@@ -2614,7 +2585,7 @@
     </w:p>
     <w:p>
       <w:pPr>
-        <w:pStyle w:val="164"/>
+        <w:pStyle w:val="165"/>
         <w:keepLines/>
         <w:jc w:val="center"/>
       </w:pPr>
@@ -3159,7 +3130,7 @@
     </w:p>
     <w:tbl>
       <w:tblPr>
-        <w:tblStyle w:val="32"/>
+        <w:tblStyle w:val="33"/>
         <w:tblW w:w="9360" w:type="dxa"/>
         <w:jc w:val="center"/>
         <w:tblBorders>
@@ -4592,7 +4563,7 @@
     </w:p>
     <w:tbl>
       <w:tblPr>
-        <w:tblStyle w:val="32"/>
+        <w:tblStyle w:val="33"/>
         <w:tblW w:w="9360" w:type="dxa"/>
         <w:jc w:val="center"/>
         <w:tblBorders>
@@ -5870,7 +5841,7 @@
     </w:p>
     <w:tbl>
       <w:tblPr>
-        <w:tblStyle w:val="32"/>
+        <w:tblStyle w:val="33"/>
         <w:tblW w:w="9360" w:type="dxa"/>
         <w:jc w:val="center"/>
         <w:tblBorders>
@@ -5910,6 +5881,12 @@
             <w:insideH w:val="single" w:color="AEB8C2" w:sz="4" w:space="0"/>
             <w:insideV w:val="single" w:color="AEB8C2" w:sz="4" w:space="0"/>
           </w:tblBorders>
+          <w:tblCellMar>
+            <w:top w:w="0" w:type="dxa"/>
+            <w:left w:w="108" w:type="dxa"/>
+            <w:bottom w:w="0" w:type="dxa"/>
+            <w:right w:w="108" w:type="dxa"/>
+          </w:tblCellMar>
         </w:tblPrEx>
         <w:trPr>
           <w:tblHeader/>
@@ -6169,6 +6146,12 @@
             <w:insideH w:val="single" w:color="AEB8C2" w:sz="4" w:space="0"/>
             <w:insideV w:val="single" w:color="AEB8C2" w:sz="4" w:space="0"/>
           </w:tblBorders>
+          <w:tblCellMar>
+            <w:top w:w="0" w:type="dxa"/>
+            <w:left w:w="108" w:type="dxa"/>
+            <w:bottom w:w="0" w:type="dxa"/>
+            <w:right w:w="108" w:type="dxa"/>
+          </w:tblCellMar>
         </w:tblPrEx>
         <w:trPr>
           <w:jc w:val="center"/>
@@ -6430,6 +6413,12 @@
             <w:insideH w:val="single" w:color="AEB8C2" w:sz="4" w:space="0"/>
             <w:insideV w:val="single" w:color="AEB8C2" w:sz="4" w:space="0"/>
           </w:tblBorders>
+          <w:tblCellMar>
+            <w:top w:w="0" w:type="dxa"/>
+            <w:left w:w="108" w:type="dxa"/>
+            <w:bottom w:w="0" w:type="dxa"/>
+            <w:right w:w="108" w:type="dxa"/>
+          </w:tblCellMar>
         </w:tblPrEx>
         <w:trPr>
           <w:jc w:val="center"/>
@@ -6708,6 +6697,12 @@
             <w:insideH w:val="single" w:color="AEB8C2" w:sz="4" w:space="0"/>
             <w:insideV w:val="single" w:color="AEB8C2" w:sz="4" w:space="0"/>
           </w:tblBorders>
+          <w:tblCellMar>
+            <w:top w:w="0" w:type="dxa"/>
+            <w:left w:w="108" w:type="dxa"/>
+            <w:bottom w:w="0" w:type="dxa"/>
+            <w:right w:w="108" w:type="dxa"/>
+          </w:tblCellMar>
         </w:tblPrEx>
         <w:trPr>
           <w:jc w:val="center"/>
@@ -7118,7 +7113,7 @@
     </w:p>
     <w:tbl>
       <w:tblPr>
-        <w:tblStyle w:val="32"/>
+        <w:tblStyle w:val="33"/>
         <w:tblW w:w="9360" w:type="dxa"/>
         <w:jc w:val="center"/>
         <w:tblBorders>
@@ -8689,7 +8684,7 @@
     </w:p>
     <w:tbl>
       <w:tblPr>
-        <w:tblStyle w:val="32"/>
+        <w:tblStyle w:val="33"/>
         <w:tblW w:w="9360" w:type="dxa"/>
         <w:jc w:val="center"/>
         <w:tblBorders>
@@ -9751,7 +9746,7 @@
     </w:p>
     <w:tbl>
       <w:tblPr>
-        <w:tblStyle w:val="32"/>
+        <w:tblStyle w:val="33"/>
         <w:tblW w:w="9360" w:type="dxa"/>
         <w:jc w:val="center"/>
         <w:tblBorders>
@@ -9790,6 +9785,12 @@
             <w:insideH w:val="single" w:color="AEB8C2" w:sz="4" w:space="0"/>
             <w:insideV w:val="single" w:color="AEB8C2" w:sz="4" w:space="0"/>
           </w:tblBorders>
+          <w:tblCellMar>
+            <w:top w:w="0" w:type="dxa"/>
+            <w:left w:w="108" w:type="dxa"/>
+            <w:bottom w:w="0" w:type="dxa"/>
+            <w:right w:w="108" w:type="dxa"/>
+          </w:tblCellMar>
         </w:tblPrEx>
         <w:trPr>
           <w:tblHeader/>
@@ -10009,6 +10010,490 @@
                 <w:sz w:val="15"/>
               </w:rPr>
               <w:t>峰值显存↓</w:t>
+            </w:r>
+          </w:p>
+        </w:tc>
+      </w:tr>
+      <w:tr>
+        <w:tblPrEx>
+          <w:tblBorders>
+            <w:top w:val="single" w:color="AEB8C2" w:sz="4" w:space="0"/>
+            <w:left w:val="single" w:color="AEB8C2" w:sz="4" w:space="0"/>
+            <w:bottom w:val="single" w:color="AEB8C2" w:sz="4" w:space="0"/>
+            <w:right w:val="single" w:color="AEB8C2" w:sz="4" w:space="0"/>
+            <w:insideH w:val="single" w:color="AEB8C2" w:sz="4" w:space="0"/>
+            <w:insideV w:val="single" w:color="AEB8C2" w:sz="4" w:space="0"/>
+          </w:tblBorders>
+          <w:tblCellMar>
+            <w:top w:w="0" w:type="dxa"/>
+            <w:left w:w="108" w:type="dxa"/>
+            <w:bottom w:w="0" w:type="dxa"/>
+            <w:right w:w="108" w:type="dxa"/>
+          </w:tblCellMar>
+        </w:tblPrEx>
+        <w:trPr>
+          <w:jc w:val="center"/>
+        </w:trPr>
+        <w:tc>
+          <w:tcPr>
+            <w:tcW w:w="922" w:type="dxa"/>
+            <w:tcMar>
+              <w:top w:w="90" w:type="dxa"/>
+              <w:left w:w="120" w:type="dxa"/>
+              <w:bottom w:w="90" w:type="dxa"/>
+              <w:right w:w="120" w:type="dxa"/>
+            </w:tcMar>
+            <w:vAlign w:val="center"/>
+          </w:tcPr>
+          <w:p>
+            <w:pPr>
+              <w:spacing w:before="0" w:after="0" w:line="259" w:lineRule="auto"/>
+              <w:jc w:val="left"/>
+            </w:pPr>
+            <w:r>
+              <w:rPr>
+                <w:rFonts w:ascii="Calibri" w:hAnsi="Calibri" w:eastAsia="宋体" w:cs="Calibri"/>
+                <w:b w:val="0"/>
+                <w:sz w:val="15"/>
+              </w:rPr>
+              <w:t>1（默认）</w:t>
+            </w:r>
+          </w:p>
+        </w:tc>
+        <w:tc>
+          <w:tcPr>
+            <w:tcW w:w="1054" w:type="dxa"/>
+            <w:tcMar>
+              <w:top w:w="90" w:type="dxa"/>
+              <w:left w:w="120" w:type="dxa"/>
+              <w:bottom w:w="90" w:type="dxa"/>
+              <w:right w:w="120" w:type="dxa"/>
+            </w:tcMar>
+            <w:vAlign w:val="center"/>
+          </w:tcPr>
+          <w:p>
+            <w:pPr>
+              <w:spacing w:before="0" w:after="0" w:line="259" w:lineRule="auto"/>
+              <w:jc w:val="center"/>
+            </w:pPr>
+            <w:r>
+              <w:rPr>
+                <w:rFonts w:ascii="Calibri" w:hAnsi="Calibri" w:eastAsia="宋体" w:cs="Calibri"/>
+                <w:b w:val="0"/>
+                <w:i/>
+                <w:sz w:val="15"/>
+              </w:rPr>
+              <w:t>q_1</w:t>
+            </w:r>
+          </w:p>
+        </w:tc>
+        <w:tc>
+          <w:tcPr>
+            <w:tcW w:w="1713" w:type="dxa"/>
+            <w:tcMar>
+              <w:top w:w="90" w:type="dxa"/>
+              <w:left w:w="120" w:type="dxa"/>
+              <w:bottom w:w="90" w:type="dxa"/>
+              <w:right w:w="120" w:type="dxa"/>
+            </w:tcMar>
+            <w:vAlign w:val="center"/>
+          </w:tcPr>
+          <w:p>
+            <w:pPr>
+              <w:spacing w:before="0" w:after="0" w:line="259" w:lineRule="auto"/>
+              <w:jc w:val="center"/>
+            </w:pPr>
+            <w:r>
+              <w:rPr>
+                <w:rFonts w:ascii="Calibri" w:hAnsi="Calibri" w:eastAsia="宋体" w:cs="Calibri"/>
+                <w:b w:val="0"/>
+                <w:color w:val="7A5A00"/>
+                <w:sz w:val="15"/>
+                <w:shd w:val="clear" w:fill="FFF2CC"/>
+              </w:rPr>
+              <w:t>____</w:t>
+            </w:r>
+          </w:p>
+        </w:tc>
+        <w:tc>
+          <w:tcPr>
+            <w:tcW w:w="1713" w:type="dxa"/>
+            <w:tcMar>
+              <w:top w:w="90" w:type="dxa"/>
+              <w:left w:w="120" w:type="dxa"/>
+              <w:bottom w:w="90" w:type="dxa"/>
+              <w:right w:w="120" w:type="dxa"/>
+            </w:tcMar>
+            <w:vAlign w:val="center"/>
+          </w:tcPr>
+          <w:p>
+            <w:pPr>
+              <w:spacing w:before="0" w:after="0" w:line="259" w:lineRule="auto"/>
+              <w:jc w:val="center"/>
+            </w:pPr>
+            <w:r>
+              <w:rPr>
+                <w:rFonts w:ascii="Calibri" w:hAnsi="Calibri" w:eastAsia="宋体" w:cs="Calibri"/>
+                <w:b w:val="0"/>
+                <w:color w:val="7A5A00"/>
+                <w:sz w:val="15"/>
+                <w:shd w:val="clear" w:fill="FFF2CC"/>
+              </w:rPr>
+              <w:t>____</w:t>
+            </w:r>
+          </w:p>
+        </w:tc>
+        <w:tc>
+          <w:tcPr>
+            <w:tcW w:w="659" w:type="dxa"/>
+            <w:tcMar>
+              <w:top w:w="90" w:type="dxa"/>
+              <w:left w:w="120" w:type="dxa"/>
+              <w:bottom w:w="90" w:type="dxa"/>
+              <w:right w:w="120" w:type="dxa"/>
+            </w:tcMar>
+            <w:vAlign w:val="center"/>
+          </w:tcPr>
+          <w:p>
+            <w:pPr>
+              <w:spacing w:before="0" w:after="0" w:line="259" w:lineRule="auto"/>
+              <w:jc w:val="center"/>
+            </w:pPr>
+            <w:r>
+              <w:rPr>
+                <w:rFonts w:ascii="Calibri" w:hAnsi="Calibri" w:eastAsia="宋体" w:cs="Calibri"/>
+                <w:b w:val="0"/>
+                <w:color w:val="7A5A00"/>
+                <w:sz w:val="15"/>
+                <w:shd w:val="clear" w:fill="FFF2CC"/>
+              </w:rPr>
+              <w:t>____</w:t>
+            </w:r>
+          </w:p>
+        </w:tc>
+        <w:tc>
+          <w:tcPr>
+            <w:tcW w:w="659" w:type="dxa"/>
+            <w:tcMar>
+              <w:top w:w="90" w:type="dxa"/>
+              <w:left w:w="120" w:type="dxa"/>
+              <w:bottom w:w="90" w:type="dxa"/>
+              <w:right w:w="120" w:type="dxa"/>
+            </w:tcMar>
+            <w:vAlign w:val="center"/>
+          </w:tcPr>
+          <w:p>
+            <w:pPr>
+              <w:spacing w:before="0" w:after="0" w:line="259" w:lineRule="auto"/>
+              <w:jc w:val="center"/>
+            </w:pPr>
+            <w:r>
+              <w:rPr>
+                <w:rFonts w:ascii="Calibri" w:hAnsi="Calibri" w:eastAsia="宋体" w:cs="Calibri"/>
+                <w:b w:val="0"/>
+                <w:color w:val="7A5A00"/>
+                <w:sz w:val="15"/>
+                <w:shd w:val="clear" w:fill="FFF2CC"/>
+              </w:rPr>
+              <w:t>____</w:t>
+            </w:r>
+          </w:p>
+        </w:tc>
+        <w:tc>
+          <w:tcPr>
+            <w:tcW w:w="1450" w:type="dxa"/>
+            <w:tcMar>
+              <w:top w:w="90" w:type="dxa"/>
+              <w:left w:w="120" w:type="dxa"/>
+              <w:bottom w:w="90" w:type="dxa"/>
+              <w:right w:w="120" w:type="dxa"/>
+            </w:tcMar>
+            <w:vAlign w:val="center"/>
+          </w:tcPr>
+          <w:p>
+            <w:pPr>
+              <w:spacing w:before="0" w:after="0" w:line="259" w:lineRule="auto"/>
+              <w:jc w:val="center"/>
+            </w:pPr>
+            <w:r>
+              <w:rPr>
+                <w:rFonts w:ascii="Calibri" w:hAnsi="Calibri" w:eastAsia="宋体" w:cs="Calibri"/>
+                <w:b w:val="0"/>
+                <w:color w:val="7A5A00"/>
+                <w:sz w:val="15"/>
+                <w:shd w:val="clear" w:fill="FFF2CC"/>
+              </w:rPr>
+              <w:t>____</w:t>
+            </w:r>
+          </w:p>
+        </w:tc>
+        <w:tc>
+          <w:tcPr>
+            <w:tcW w:w="1190" w:type="dxa"/>
+            <w:tcMar>
+              <w:top w:w="90" w:type="dxa"/>
+              <w:left w:w="120" w:type="dxa"/>
+              <w:bottom w:w="90" w:type="dxa"/>
+              <w:right w:w="120" w:type="dxa"/>
+            </w:tcMar>
+            <w:vAlign w:val="center"/>
+          </w:tcPr>
+          <w:p>
+            <w:pPr>
+              <w:spacing w:before="0" w:after="0" w:line="259" w:lineRule="auto"/>
+              <w:jc w:val="center"/>
+            </w:pPr>
+            <w:r>
+              <w:rPr>
+                <w:rFonts w:ascii="Calibri" w:hAnsi="Calibri" w:eastAsia="宋体" w:cs="Calibri"/>
+                <w:b w:val="0"/>
+                <w:color w:val="7A5A00"/>
+                <w:sz w:val="15"/>
+                <w:shd w:val="clear" w:fill="FFF2CC"/>
+              </w:rPr>
+              <w:t>____</w:t>
+            </w:r>
+          </w:p>
+        </w:tc>
+      </w:tr>
+      <w:tr>
+        <w:tblPrEx>
+          <w:tblBorders>
+            <w:top w:val="single" w:color="AEB8C2" w:sz="4" w:space="0"/>
+            <w:left w:val="single" w:color="AEB8C2" w:sz="4" w:space="0"/>
+            <w:bottom w:val="single" w:color="AEB8C2" w:sz="4" w:space="0"/>
+            <w:right w:val="single" w:color="AEB8C2" w:sz="4" w:space="0"/>
+            <w:insideH w:val="single" w:color="AEB8C2" w:sz="4" w:space="0"/>
+            <w:insideV w:val="single" w:color="AEB8C2" w:sz="4" w:space="0"/>
+          </w:tblBorders>
+          <w:tblCellMar>
+            <w:top w:w="0" w:type="dxa"/>
+            <w:left w:w="108" w:type="dxa"/>
+            <w:bottom w:w="0" w:type="dxa"/>
+            <w:right w:w="108" w:type="dxa"/>
+          </w:tblCellMar>
+        </w:tblPrEx>
+        <w:trPr>
+          <w:jc w:val="center"/>
+        </w:trPr>
+        <w:tc>
+          <w:tcPr>
+            <w:tcW w:w="922" w:type="dxa"/>
+            <w:tcMar>
+              <w:top w:w="90" w:type="dxa"/>
+              <w:left w:w="120" w:type="dxa"/>
+              <w:bottom w:w="90" w:type="dxa"/>
+              <w:right w:w="120" w:type="dxa"/>
+            </w:tcMar>
+            <w:vAlign w:val="center"/>
+          </w:tcPr>
+          <w:p>
+            <w:pPr>
+              <w:spacing w:before="0" w:after="0" w:line="259" w:lineRule="auto"/>
+              <w:jc w:val="left"/>
+            </w:pPr>
+            <w:r>
+              <w:rPr>
+                <w:rFonts w:ascii="Calibri" w:hAnsi="Calibri" w:eastAsia="宋体" w:cs="Calibri"/>
+                <w:b w:val="0"/>
+                <w:sz w:val="15"/>
+              </w:rPr>
+              <w:t>2</w:t>
+            </w:r>
+          </w:p>
+        </w:tc>
+        <w:tc>
+          <w:tcPr>
+            <w:tcW w:w="1054" w:type="dxa"/>
+            <w:tcMar>
+              <w:top w:w="90" w:type="dxa"/>
+              <w:left w:w="120" w:type="dxa"/>
+              <w:bottom w:w="90" w:type="dxa"/>
+              <w:right w:w="120" w:type="dxa"/>
+            </w:tcMar>
+            <w:vAlign w:val="center"/>
+          </w:tcPr>
+          <w:p>
+            <w:pPr>
+              <w:spacing w:before="0" w:after="0" w:line="259" w:lineRule="auto"/>
+              <w:jc w:val="center"/>
+            </w:pPr>
+            <w:r>
+              <w:rPr>
+                <w:rFonts w:ascii="Calibri" w:hAnsi="Calibri" w:eastAsia="宋体" w:cs="Calibri"/>
+                <w:b w:val="0"/>
+                <w:i/>
+                <w:sz w:val="15"/>
+              </w:rPr>
+              <w:t>q_2</w:t>
+            </w:r>
+          </w:p>
+        </w:tc>
+        <w:tc>
+          <w:tcPr>
+            <w:tcW w:w="1713" w:type="dxa"/>
+            <w:tcMar>
+              <w:top w:w="90" w:type="dxa"/>
+              <w:left w:w="120" w:type="dxa"/>
+              <w:bottom w:w="90" w:type="dxa"/>
+              <w:right w:w="120" w:type="dxa"/>
+            </w:tcMar>
+            <w:vAlign w:val="center"/>
+          </w:tcPr>
+          <w:p>
+            <w:pPr>
+              <w:spacing w:before="0" w:after="0" w:line="259" w:lineRule="auto"/>
+              <w:jc w:val="center"/>
+            </w:pPr>
+            <w:r>
+              <w:rPr>
+                <w:rFonts w:ascii="Calibri" w:hAnsi="Calibri" w:eastAsia="宋体" w:cs="Calibri"/>
+                <w:b w:val="0"/>
+                <w:color w:val="7A5A00"/>
+                <w:sz w:val="15"/>
+                <w:shd w:val="clear" w:fill="FFF2CC"/>
+              </w:rPr>
+              <w:t>____</w:t>
+            </w:r>
+          </w:p>
+        </w:tc>
+        <w:tc>
+          <w:tcPr>
+            <w:tcW w:w="1713" w:type="dxa"/>
+            <w:tcMar>
+              <w:top w:w="90" w:type="dxa"/>
+              <w:left w:w="120" w:type="dxa"/>
+              <w:bottom w:w="90" w:type="dxa"/>
+              <w:right w:w="120" w:type="dxa"/>
+            </w:tcMar>
+            <w:vAlign w:val="center"/>
+          </w:tcPr>
+          <w:p>
+            <w:pPr>
+              <w:spacing w:before="0" w:after="0" w:line="259" w:lineRule="auto"/>
+              <w:jc w:val="center"/>
+            </w:pPr>
+            <w:r>
+              <w:rPr>
+                <w:rFonts w:ascii="Calibri" w:hAnsi="Calibri" w:eastAsia="宋体" w:cs="Calibri"/>
+                <w:b w:val="0"/>
+                <w:color w:val="7A5A00"/>
+                <w:sz w:val="15"/>
+                <w:shd w:val="clear" w:fill="FFF2CC"/>
+              </w:rPr>
+              <w:t>____</w:t>
+            </w:r>
+          </w:p>
+        </w:tc>
+        <w:tc>
+          <w:tcPr>
+            <w:tcW w:w="659" w:type="dxa"/>
+            <w:tcMar>
+              <w:top w:w="90" w:type="dxa"/>
+              <w:left w:w="120" w:type="dxa"/>
+              <w:bottom w:w="90" w:type="dxa"/>
+              <w:right w:w="120" w:type="dxa"/>
+            </w:tcMar>
+            <w:vAlign w:val="center"/>
+          </w:tcPr>
+          <w:p>
+            <w:pPr>
+              <w:spacing w:before="0" w:after="0" w:line="259" w:lineRule="auto"/>
+              <w:jc w:val="center"/>
+            </w:pPr>
+            <w:r>
+              <w:rPr>
+                <w:rFonts w:ascii="Calibri" w:hAnsi="Calibri" w:eastAsia="宋体" w:cs="Calibri"/>
+                <w:b w:val="0"/>
+                <w:color w:val="7A5A00"/>
+                <w:sz w:val="15"/>
+                <w:shd w:val="clear" w:fill="FFF2CC"/>
+              </w:rPr>
+              <w:t>____</w:t>
+            </w:r>
+          </w:p>
+        </w:tc>
+        <w:tc>
+          <w:tcPr>
+            <w:tcW w:w="659" w:type="dxa"/>
+            <w:tcMar>
+              <w:top w:w="90" w:type="dxa"/>
+              <w:left w:w="120" w:type="dxa"/>
+              <w:bottom w:w="90" w:type="dxa"/>
+              <w:right w:w="120" w:type="dxa"/>
+            </w:tcMar>
+            <w:vAlign w:val="center"/>
+          </w:tcPr>
+          <w:p>
+            <w:pPr>
+              <w:spacing w:before="0" w:after="0" w:line="259" w:lineRule="auto"/>
+              <w:jc w:val="center"/>
+            </w:pPr>
+            <w:r>
+              <w:rPr>
+                <w:rFonts w:ascii="Calibri" w:hAnsi="Calibri" w:eastAsia="宋体" w:cs="Calibri"/>
+                <w:b w:val="0"/>
+                <w:color w:val="7A5A00"/>
+                <w:sz w:val="15"/>
+                <w:shd w:val="clear" w:fill="FFF2CC"/>
+              </w:rPr>
+              <w:t>____</w:t>
+            </w:r>
+          </w:p>
+        </w:tc>
+        <w:tc>
+          <w:tcPr>
+            <w:tcW w:w="1450" w:type="dxa"/>
+            <w:tcMar>
+              <w:top w:w="90" w:type="dxa"/>
+              <w:left w:w="120" w:type="dxa"/>
+              <w:bottom w:w="90" w:type="dxa"/>
+              <w:right w:w="120" w:type="dxa"/>
+            </w:tcMar>
+            <w:vAlign w:val="center"/>
+          </w:tcPr>
+          <w:p>
+            <w:pPr>
+              <w:spacing w:before="0" w:after="0" w:line="259" w:lineRule="auto"/>
+              <w:jc w:val="center"/>
+            </w:pPr>
+            <w:r>
+              <w:rPr>
+                <w:rFonts w:ascii="Calibri" w:hAnsi="Calibri" w:eastAsia="宋体" w:cs="Calibri"/>
+                <w:b w:val="0"/>
+                <w:color w:val="7A5A00"/>
+                <w:sz w:val="15"/>
+                <w:shd w:val="clear" w:fill="FFF2CC"/>
+              </w:rPr>
+              <w:t>____</w:t>
+            </w:r>
+          </w:p>
+        </w:tc>
+        <w:tc>
+          <w:tcPr>
+            <w:tcW w:w="1190" w:type="dxa"/>
+            <w:tcMar>
+              <w:top w:w="90" w:type="dxa"/>
+              <w:left w:w="120" w:type="dxa"/>
+              <w:bottom w:w="90" w:type="dxa"/>
+              <w:right w:w="120" w:type="dxa"/>
+            </w:tcMar>
+            <w:vAlign w:val="center"/>
+          </w:tcPr>
+          <w:p>
+            <w:pPr>
+              <w:spacing w:before="0" w:after="0" w:line="259" w:lineRule="auto"/>
+              <w:jc w:val="center"/>
+            </w:pPr>
+            <w:r>
+              <w:rPr>
+                <w:rFonts w:ascii="Calibri" w:hAnsi="Calibri" w:eastAsia="宋体" w:cs="Calibri"/>
+                <w:b w:val="0"/>
+                <w:color w:val="7A5A00"/>
+                <w:sz w:val="15"/>
+                <w:shd w:val="clear" w:fill="FFF2CC"/>
+              </w:rPr>
+              <w:t>____</w:t>
             </w:r>
           </w:p>
         </w:tc>
@@ -10049,478 +10534,6 @@
                 <w:b w:val="0"/>
                 <w:sz w:val="15"/>
               </w:rPr>
-              <w:t>1（默认）</w:t>
-            </w:r>
-          </w:p>
-        </w:tc>
-        <w:tc>
-          <w:tcPr>
-            <w:tcW w:w="1054" w:type="dxa"/>
-            <w:tcMar>
-              <w:top w:w="90" w:type="dxa"/>
-              <w:left w:w="120" w:type="dxa"/>
-              <w:bottom w:w="90" w:type="dxa"/>
-              <w:right w:w="120" w:type="dxa"/>
-            </w:tcMar>
-            <w:vAlign w:val="center"/>
-          </w:tcPr>
-          <w:p>
-            <w:pPr>
-              <w:spacing w:before="0" w:after="0" w:line="259" w:lineRule="auto"/>
-              <w:jc w:val="center"/>
-            </w:pPr>
-            <w:r>
-              <w:rPr>
-                <w:rFonts w:ascii="Calibri" w:hAnsi="Calibri" w:eastAsia="宋体" w:cs="Calibri"/>
-                <w:b w:val="0"/>
-                <w:i/>
-                <w:sz w:val="15"/>
-              </w:rPr>
-              <w:t>q_1</w:t>
-            </w:r>
-          </w:p>
-        </w:tc>
-        <w:tc>
-          <w:tcPr>
-            <w:tcW w:w="1713" w:type="dxa"/>
-            <w:tcMar>
-              <w:top w:w="90" w:type="dxa"/>
-              <w:left w:w="120" w:type="dxa"/>
-              <w:bottom w:w="90" w:type="dxa"/>
-              <w:right w:w="120" w:type="dxa"/>
-            </w:tcMar>
-            <w:vAlign w:val="center"/>
-          </w:tcPr>
-          <w:p>
-            <w:pPr>
-              <w:spacing w:before="0" w:after="0" w:line="259" w:lineRule="auto"/>
-              <w:jc w:val="center"/>
-            </w:pPr>
-            <w:r>
-              <w:rPr>
-                <w:rFonts w:ascii="Calibri" w:hAnsi="Calibri" w:eastAsia="宋体" w:cs="Calibri"/>
-                <w:b w:val="0"/>
-                <w:color w:val="7A5A00"/>
-                <w:sz w:val="15"/>
-                <w:shd w:val="clear" w:fill="FFF2CC"/>
-              </w:rPr>
-              <w:t>____</w:t>
-            </w:r>
-          </w:p>
-        </w:tc>
-        <w:tc>
-          <w:tcPr>
-            <w:tcW w:w="1713" w:type="dxa"/>
-            <w:tcMar>
-              <w:top w:w="90" w:type="dxa"/>
-              <w:left w:w="120" w:type="dxa"/>
-              <w:bottom w:w="90" w:type="dxa"/>
-              <w:right w:w="120" w:type="dxa"/>
-            </w:tcMar>
-            <w:vAlign w:val="center"/>
-          </w:tcPr>
-          <w:p>
-            <w:pPr>
-              <w:spacing w:before="0" w:after="0" w:line="259" w:lineRule="auto"/>
-              <w:jc w:val="center"/>
-            </w:pPr>
-            <w:r>
-              <w:rPr>
-                <w:rFonts w:ascii="Calibri" w:hAnsi="Calibri" w:eastAsia="宋体" w:cs="Calibri"/>
-                <w:b w:val="0"/>
-                <w:color w:val="7A5A00"/>
-                <w:sz w:val="15"/>
-                <w:shd w:val="clear" w:fill="FFF2CC"/>
-              </w:rPr>
-              <w:t>____</w:t>
-            </w:r>
-          </w:p>
-        </w:tc>
-        <w:tc>
-          <w:tcPr>
-            <w:tcW w:w="659" w:type="dxa"/>
-            <w:tcMar>
-              <w:top w:w="90" w:type="dxa"/>
-              <w:left w:w="120" w:type="dxa"/>
-              <w:bottom w:w="90" w:type="dxa"/>
-              <w:right w:w="120" w:type="dxa"/>
-            </w:tcMar>
-            <w:vAlign w:val="center"/>
-          </w:tcPr>
-          <w:p>
-            <w:pPr>
-              <w:spacing w:before="0" w:after="0" w:line="259" w:lineRule="auto"/>
-              <w:jc w:val="center"/>
-            </w:pPr>
-            <w:r>
-              <w:rPr>
-                <w:rFonts w:ascii="Calibri" w:hAnsi="Calibri" w:eastAsia="宋体" w:cs="Calibri"/>
-                <w:b w:val="0"/>
-                <w:color w:val="7A5A00"/>
-                <w:sz w:val="15"/>
-                <w:shd w:val="clear" w:fill="FFF2CC"/>
-              </w:rPr>
-              <w:t>____</w:t>
-            </w:r>
-          </w:p>
-        </w:tc>
-        <w:tc>
-          <w:tcPr>
-            <w:tcW w:w="659" w:type="dxa"/>
-            <w:tcMar>
-              <w:top w:w="90" w:type="dxa"/>
-              <w:left w:w="120" w:type="dxa"/>
-              <w:bottom w:w="90" w:type="dxa"/>
-              <w:right w:w="120" w:type="dxa"/>
-            </w:tcMar>
-            <w:vAlign w:val="center"/>
-          </w:tcPr>
-          <w:p>
-            <w:pPr>
-              <w:spacing w:before="0" w:after="0" w:line="259" w:lineRule="auto"/>
-              <w:jc w:val="center"/>
-            </w:pPr>
-            <w:r>
-              <w:rPr>
-                <w:rFonts w:ascii="Calibri" w:hAnsi="Calibri" w:eastAsia="宋体" w:cs="Calibri"/>
-                <w:b w:val="0"/>
-                <w:color w:val="7A5A00"/>
-                <w:sz w:val="15"/>
-                <w:shd w:val="clear" w:fill="FFF2CC"/>
-              </w:rPr>
-              <w:t>____</w:t>
-            </w:r>
-          </w:p>
-        </w:tc>
-        <w:tc>
-          <w:tcPr>
-            <w:tcW w:w="1450" w:type="dxa"/>
-            <w:tcMar>
-              <w:top w:w="90" w:type="dxa"/>
-              <w:left w:w="120" w:type="dxa"/>
-              <w:bottom w:w="90" w:type="dxa"/>
-              <w:right w:w="120" w:type="dxa"/>
-            </w:tcMar>
-            <w:vAlign w:val="center"/>
-          </w:tcPr>
-          <w:p>
-            <w:pPr>
-              <w:spacing w:before="0" w:after="0" w:line="259" w:lineRule="auto"/>
-              <w:jc w:val="center"/>
-            </w:pPr>
-            <w:r>
-              <w:rPr>
-                <w:rFonts w:ascii="Calibri" w:hAnsi="Calibri" w:eastAsia="宋体" w:cs="Calibri"/>
-                <w:b w:val="0"/>
-                <w:color w:val="7A5A00"/>
-                <w:sz w:val="15"/>
-                <w:shd w:val="clear" w:fill="FFF2CC"/>
-              </w:rPr>
-              <w:t>____</w:t>
-            </w:r>
-          </w:p>
-        </w:tc>
-        <w:tc>
-          <w:tcPr>
-            <w:tcW w:w="1190" w:type="dxa"/>
-            <w:tcMar>
-              <w:top w:w="90" w:type="dxa"/>
-              <w:left w:w="120" w:type="dxa"/>
-              <w:bottom w:w="90" w:type="dxa"/>
-              <w:right w:w="120" w:type="dxa"/>
-            </w:tcMar>
-            <w:vAlign w:val="center"/>
-          </w:tcPr>
-          <w:p>
-            <w:pPr>
-              <w:spacing w:before="0" w:after="0" w:line="259" w:lineRule="auto"/>
-              <w:jc w:val="center"/>
-            </w:pPr>
-            <w:r>
-              <w:rPr>
-                <w:rFonts w:ascii="Calibri" w:hAnsi="Calibri" w:eastAsia="宋体" w:cs="Calibri"/>
-                <w:b w:val="0"/>
-                <w:color w:val="7A5A00"/>
-                <w:sz w:val="15"/>
-                <w:shd w:val="clear" w:fill="FFF2CC"/>
-              </w:rPr>
-              <w:t>____</w:t>
-            </w:r>
-          </w:p>
-        </w:tc>
-      </w:tr>
-      <w:tr>
-        <w:tblPrEx>
-          <w:tblBorders>
-            <w:top w:val="single" w:color="AEB8C2" w:sz="4" w:space="0"/>
-            <w:left w:val="single" w:color="AEB8C2" w:sz="4" w:space="0"/>
-            <w:bottom w:val="single" w:color="AEB8C2" w:sz="4" w:space="0"/>
-            <w:right w:val="single" w:color="AEB8C2" w:sz="4" w:space="0"/>
-            <w:insideH w:val="single" w:color="AEB8C2" w:sz="4" w:space="0"/>
-            <w:insideV w:val="single" w:color="AEB8C2" w:sz="4" w:space="0"/>
-          </w:tblBorders>
-        </w:tblPrEx>
-        <w:trPr>
-          <w:jc w:val="center"/>
-        </w:trPr>
-        <w:tc>
-          <w:tcPr>
-            <w:tcW w:w="922" w:type="dxa"/>
-            <w:tcMar>
-              <w:top w:w="90" w:type="dxa"/>
-              <w:left w:w="120" w:type="dxa"/>
-              <w:bottom w:w="90" w:type="dxa"/>
-              <w:right w:w="120" w:type="dxa"/>
-            </w:tcMar>
-            <w:vAlign w:val="center"/>
-          </w:tcPr>
-          <w:p>
-            <w:pPr>
-              <w:spacing w:before="0" w:after="0" w:line="259" w:lineRule="auto"/>
-              <w:jc w:val="left"/>
-            </w:pPr>
-            <w:r>
-              <w:rPr>
-                <w:rFonts w:ascii="Calibri" w:hAnsi="Calibri" w:eastAsia="宋体" w:cs="Calibri"/>
-                <w:b w:val="0"/>
-                <w:sz w:val="15"/>
-              </w:rPr>
-              <w:t>2</w:t>
-            </w:r>
-          </w:p>
-        </w:tc>
-        <w:tc>
-          <w:tcPr>
-            <w:tcW w:w="1054" w:type="dxa"/>
-            <w:tcMar>
-              <w:top w:w="90" w:type="dxa"/>
-              <w:left w:w="120" w:type="dxa"/>
-              <w:bottom w:w="90" w:type="dxa"/>
-              <w:right w:w="120" w:type="dxa"/>
-            </w:tcMar>
-            <w:vAlign w:val="center"/>
-          </w:tcPr>
-          <w:p>
-            <w:pPr>
-              <w:spacing w:before="0" w:after="0" w:line="259" w:lineRule="auto"/>
-              <w:jc w:val="center"/>
-            </w:pPr>
-            <w:r>
-              <w:rPr>
-                <w:rFonts w:ascii="Calibri" w:hAnsi="Calibri" w:eastAsia="宋体" w:cs="Calibri"/>
-                <w:b w:val="0"/>
-                <w:i/>
-                <w:sz w:val="15"/>
-              </w:rPr>
-              <w:t>q_2</w:t>
-            </w:r>
-          </w:p>
-        </w:tc>
-        <w:tc>
-          <w:tcPr>
-            <w:tcW w:w="1713" w:type="dxa"/>
-            <w:tcMar>
-              <w:top w:w="90" w:type="dxa"/>
-              <w:left w:w="120" w:type="dxa"/>
-              <w:bottom w:w="90" w:type="dxa"/>
-              <w:right w:w="120" w:type="dxa"/>
-            </w:tcMar>
-            <w:vAlign w:val="center"/>
-          </w:tcPr>
-          <w:p>
-            <w:pPr>
-              <w:spacing w:before="0" w:after="0" w:line="259" w:lineRule="auto"/>
-              <w:jc w:val="center"/>
-            </w:pPr>
-            <w:r>
-              <w:rPr>
-                <w:rFonts w:ascii="Calibri" w:hAnsi="Calibri" w:eastAsia="宋体" w:cs="Calibri"/>
-                <w:b w:val="0"/>
-                <w:color w:val="7A5A00"/>
-                <w:sz w:val="15"/>
-                <w:shd w:val="clear" w:fill="FFF2CC"/>
-              </w:rPr>
-              <w:t>____</w:t>
-            </w:r>
-          </w:p>
-        </w:tc>
-        <w:tc>
-          <w:tcPr>
-            <w:tcW w:w="1713" w:type="dxa"/>
-            <w:tcMar>
-              <w:top w:w="90" w:type="dxa"/>
-              <w:left w:w="120" w:type="dxa"/>
-              <w:bottom w:w="90" w:type="dxa"/>
-              <w:right w:w="120" w:type="dxa"/>
-            </w:tcMar>
-            <w:vAlign w:val="center"/>
-          </w:tcPr>
-          <w:p>
-            <w:pPr>
-              <w:spacing w:before="0" w:after="0" w:line="259" w:lineRule="auto"/>
-              <w:jc w:val="center"/>
-            </w:pPr>
-            <w:r>
-              <w:rPr>
-                <w:rFonts w:ascii="Calibri" w:hAnsi="Calibri" w:eastAsia="宋体" w:cs="Calibri"/>
-                <w:b w:val="0"/>
-                <w:color w:val="7A5A00"/>
-                <w:sz w:val="15"/>
-                <w:shd w:val="clear" w:fill="FFF2CC"/>
-              </w:rPr>
-              <w:t>____</w:t>
-            </w:r>
-          </w:p>
-        </w:tc>
-        <w:tc>
-          <w:tcPr>
-            <w:tcW w:w="659" w:type="dxa"/>
-            <w:tcMar>
-              <w:top w:w="90" w:type="dxa"/>
-              <w:left w:w="120" w:type="dxa"/>
-              <w:bottom w:w="90" w:type="dxa"/>
-              <w:right w:w="120" w:type="dxa"/>
-            </w:tcMar>
-            <w:vAlign w:val="center"/>
-          </w:tcPr>
-          <w:p>
-            <w:pPr>
-              <w:spacing w:before="0" w:after="0" w:line="259" w:lineRule="auto"/>
-              <w:jc w:val="center"/>
-            </w:pPr>
-            <w:r>
-              <w:rPr>
-                <w:rFonts w:ascii="Calibri" w:hAnsi="Calibri" w:eastAsia="宋体" w:cs="Calibri"/>
-                <w:b w:val="0"/>
-                <w:color w:val="7A5A00"/>
-                <w:sz w:val="15"/>
-                <w:shd w:val="clear" w:fill="FFF2CC"/>
-              </w:rPr>
-              <w:t>____</w:t>
-            </w:r>
-          </w:p>
-        </w:tc>
-        <w:tc>
-          <w:tcPr>
-            <w:tcW w:w="659" w:type="dxa"/>
-            <w:tcMar>
-              <w:top w:w="90" w:type="dxa"/>
-              <w:left w:w="120" w:type="dxa"/>
-              <w:bottom w:w="90" w:type="dxa"/>
-              <w:right w:w="120" w:type="dxa"/>
-            </w:tcMar>
-            <w:vAlign w:val="center"/>
-          </w:tcPr>
-          <w:p>
-            <w:pPr>
-              <w:spacing w:before="0" w:after="0" w:line="259" w:lineRule="auto"/>
-              <w:jc w:val="center"/>
-            </w:pPr>
-            <w:r>
-              <w:rPr>
-                <w:rFonts w:ascii="Calibri" w:hAnsi="Calibri" w:eastAsia="宋体" w:cs="Calibri"/>
-                <w:b w:val="0"/>
-                <w:color w:val="7A5A00"/>
-                <w:sz w:val="15"/>
-                <w:shd w:val="clear" w:fill="FFF2CC"/>
-              </w:rPr>
-              <w:t>____</w:t>
-            </w:r>
-          </w:p>
-        </w:tc>
-        <w:tc>
-          <w:tcPr>
-            <w:tcW w:w="1450" w:type="dxa"/>
-            <w:tcMar>
-              <w:top w:w="90" w:type="dxa"/>
-              <w:left w:w="120" w:type="dxa"/>
-              <w:bottom w:w="90" w:type="dxa"/>
-              <w:right w:w="120" w:type="dxa"/>
-            </w:tcMar>
-            <w:vAlign w:val="center"/>
-          </w:tcPr>
-          <w:p>
-            <w:pPr>
-              <w:spacing w:before="0" w:after="0" w:line="259" w:lineRule="auto"/>
-              <w:jc w:val="center"/>
-            </w:pPr>
-            <w:r>
-              <w:rPr>
-                <w:rFonts w:ascii="Calibri" w:hAnsi="Calibri" w:eastAsia="宋体" w:cs="Calibri"/>
-                <w:b w:val="0"/>
-                <w:color w:val="7A5A00"/>
-                <w:sz w:val="15"/>
-                <w:shd w:val="clear" w:fill="FFF2CC"/>
-              </w:rPr>
-              <w:t>____</w:t>
-            </w:r>
-          </w:p>
-        </w:tc>
-        <w:tc>
-          <w:tcPr>
-            <w:tcW w:w="1190" w:type="dxa"/>
-            <w:tcMar>
-              <w:top w:w="90" w:type="dxa"/>
-              <w:left w:w="120" w:type="dxa"/>
-              <w:bottom w:w="90" w:type="dxa"/>
-              <w:right w:w="120" w:type="dxa"/>
-            </w:tcMar>
-            <w:vAlign w:val="center"/>
-          </w:tcPr>
-          <w:p>
-            <w:pPr>
-              <w:spacing w:before="0" w:after="0" w:line="259" w:lineRule="auto"/>
-              <w:jc w:val="center"/>
-            </w:pPr>
-            <w:r>
-              <w:rPr>
-                <w:rFonts w:ascii="Calibri" w:hAnsi="Calibri" w:eastAsia="宋体" w:cs="Calibri"/>
-                <w:b w:val="0"/>
-                <w:color w:val="7A5A00"/>
-                <w:sz w:val="15"/>
-                <w:shd w:val="clear" w:fill="FFF2CC"/>
-              </w:rPr>
-              <w:t>____</w:t>
-            </w:r>
-          </w:p>
-        </w:tc>
-      </w:tr>
-      <w:tr>
-        <w:tblPrEx>
-          <w:tblBorders>
-            <w:top w:val="single" w:color="AEB8C2" w:sz="4" w:space="0"/>
-            <w:left w:val="single" w:color="AEB8C2" w:sz="4" w:space="0"/>
-            <w:bottom w:val="single" w:color="AEB8C2" w:sz="4" w:space="0"/>
-            <w:right w:val="single" w:color="AEB8C2" w:sz="4" w:space="0"/>
-            <w:insideH w:val="single" w:color="AEB8C2" w:sz="4" w:space="0"/>
-            <w:insideV w:val="single" w:color="AEB8C2" w:sz="4" w:space="0"/>
-          </w:tblBorders>
-        </w:tblPrEx>
-        <w:trPr>
-          <w:jc w:val="center"/>
-        </w:trPr>
-        <w:tc>
-          <w:tcPr>
-            <w:tcW w:w="922" w:type="dxa"/>
-            <w:tcMar>
-              <w:top w:w="90" w:type="dxa"/>
-              <w:left w:w="120" w:type="dxa"/>
-              <w:bottom w:w="90" w:type="dxa"/>
-              <w:right w:w="120" w:type="dxa"/>
-            </w:tcMar>
-            <w:vAlign w:val="center"/>
-          </w:tcPr>
-          <w:p>
-            <w:pPr>
-              <w:spacing w:before="0" w:after="0" w:line="259" w:lineRule="auto"/>
-              <w:jc w:val="left"/>
-            </w:pPr>
-            <w:r>
-              <w:rPr>
-                <w:rFonts w:ascii="Calibri" w:hAnsi="Calibri" w:eastAsia="宋体" w:cs="Calibri"/>
-                <w:b w:val="0"/>
-                <w:sz w:val="15"/>
-              </w:rPr>
               <w:t>3</w:t>
             </w:r>
           </w:p>
@@ -10972,7 +10985,7 @@
     </w:p>
     <w:tbl>
       <w:tblPr>
-        <w:tblStyle w:val="32"/>
+        <w:tblStyle w:val="33"/>
         <w:tblW w:w="9360" w:type="dxa"/>
         <w:jc w:val="center"/>
         <w:tblBorders>
@@ -12163,7 +12176,7 @@
     </w:p>
     <w:tbl>
       <w:tblPr>
-        <w:tblStyle w:val="32"/>
+        <w:tblStyle w:val="33"/>
         <w:tblW w:w="9360" w:type="dxa"/>
         <w:jc w:val="center"/>
         <w:tblBorders>
@@ -13076,7 +13089,7 @@
     </w:p>
     <w:tbl>
       <w:tblPr>
-        <w:tblStyle w:val="32"/>
+        <w:tblStyle w:val="33"/>
         <w:tblW w:w="9360" w:type="dxa"/>
         <w:jc w:val="center"/>
         <w:tblBorders>
@@ -13115,6 +13128,12 @@
             <w:insideH w:val="single" w:color="AEB8C2" w:sz="4" w:space="0"/>
             <w:insideV w:val="single" w:color="AEB8C2" w:sz="4" w:space="0"/>
           </w:tblBorders>
+          <w:tblCellMar>
+            <w:top w:w="0" w:type="dxa"/>
+            <w:left w:w="108" w:type="dxa"/>
+            <w:bottom w:w="0" w:type="dxa"/>
+            <w:right w:w="108" w:type="dxa"/>
+          </w:tblCellMar>
         </w:tblPrEx>
         <w:trPr>
           <w:tblHeader/>
@@ -13347,6 +13366,12 @@
             <w:insideH w:val="single" w:color="AEB8C2" w:sz="4" w:space="0"/>
             <w:insideV w:val="single" w:color="AEB8C2" w:sz="4" w:space="0"/>
           </w:tblBorders>
+          <w:tblCellMar>
+            <w:top w:w="0" w:type="dxa"/>
+            <w:left w:w="108" w:type="dxa"/>
+            <w:bottom w:w="0" w:type="dxa"/>
+            <w:right w:w="108" w:type="dxa"/>
+          </w:tblCellMar>
         </w:tblPrEx>
         <w:trPr>
           <w:jc w:val="center"/>
@@ -13580,6 +13605,12 @@
             <w:insideH w:val="single" w:color="AEB8C2" w:sz="4" w:space="0"/>
             <w:insideV w:val="single" w:color="AEB8C2" w:sz="4" w:space="0"/>
           </w:tblBorders>
+          <w:tblCellMar>
+            <w:top w:w="0" w:type="dxa"/>
+            <w:left w:w="108" w:type="dxa"/>
+            <w:bottom w:w="0" w:type="dxa"/>
+            <w:right w:w="108" w:type="dxa"/>
+          </w:tblCellMar>
         </w:tblPrEx>
         <w:trPr>
           <w:jc w:val="center"/>
@@ -14011,7 +14042,7 @@
     </w:p>
     <w:tbl>
       <w:tblPr>
-        <w:tblStyle w:val="32"/>
+        <w:tblStyle w:val="33"/>
         <w:tblW w:w="9360" w:type="dxa"/>
         <w:jc w:val="center"/>
         <w:tblBorders>
@@ -15802,6 +15833,201 @@
           <w:sz w:val="17"/>
         </w:rPr>
         <w:t>[12] X. Yao, J. Gao, and C. Xu, “NavMorph: A Self-Evolving World Model for Vision-and-Language Navigation in Continuous Environments,” in Proc. IEEE/CVF Int. Conf. Comput. Vis. (ICCV), 2025, pp. 5536–5546, doi: 10.1109/ICCV51701.2025.00525.</w:t>
+      </w:r>
+    </w:p>
+    <w:p>
+      <w:pPr>
+        <w:spacing w:before="0" w:after="60" w:line="240" w:lineRule="auto"/>
+        <w:ind w:left="360" w:hanging="360"/>
+      </w:pPr>
+      <w:r>
+        <w:rPr>
+          <w:rFonts w:ascii="Calibri" w:hAnsi="Calibri" w:eastAsia="宋体"/>
+          <w:sz w:val="17"/>
+        </w:rPr>
+        <w:t>[13] J. Krantz, A. Gokaslan, D. Batra, S. Lee, and O. Maksymets, “Waypoint Models for Instruction-Guided Navigation in Continuous Environments,” in Proc. IEEE/CVF Int. Conf. Comput. Vis. (ICCV), 2021, pp. 15162–15171.</w:t>
+      </w:r>
+    </w:p>
+    <w:p>
+      <w:pPr>
+        <w:spacing w:before="0" w:after="60" w:line="240" w:lineRule="auto"/>
+        <w:ind w:left="360" w:hanging="360"/>
+      </w:pPr>
+      <w:r>
+        <w:rPr>
+          <w:rFonts w:ascii="Calibri" w:hAnsi="Calibri" w:eastAsia="宋体"/>
+          <w:sz w:val="17"/>
+        </w:rPr>
+        <w:t>[14] D. An, Y. Qi, Y. Li, Y. Huang, L. Wang, T. Tan, and J. Shao, “BEVBert: Multimodal Map Pre-Training for Language-Guided Navigation,” in Proc. IEEE/CVF Int. Conf. Comput. Vis. (ICCV), 2023, pp. 2737–2748.</w:t>
+      </w:r>
+    </w:p>
+    <w:p>
+      <w:pPr>
+        <w:spacing w:before="0" w:after="60" w:line="240" w:lineRule="auto"/>
+        <w:ind w:left="360" w:hanging="360"/>
+      </w:pPr>
+      <w:r>
+        <w:rPr>
+          <w:rFonts w:ascii="Calibri" w:hAnsi="Calibri" w:eastAsia="宋体"/>
+          <w:sz w:val="17"/>
+        </w:rPr>
+        <w:t>[15] Z. Wang, X. Li, J. Yang, Y. Liu, and S. Jiang, “GridMM: Grid Memory Map for Vision-and-Language Navigation,” in Proc. IEEE/CVF Int. Conf. Comput. Vis. (ICCV), 2023, pp. 15579–15590.</w:t>
+      </w:r>
+    </w:p>
+    <w:p>
+      <w:pPr>
+        <w:spacing w:before="0" w:after="60" w:line="240" w:lineRule="auto"/>
+        <w:ind w:left="360" w:hanging="360"/>
+      </w:pPr>
+      <w:r>
+        <w:rPr>
+          <w:rFonts w:ascii="Calibri" w:hAnsi="Calibri" w:eastAsia="宋体"/>
+          <w:sz w:val="17"/>
+        </w:rPr>
+        <w:t>[16] Y. Han, G. Huang, S. Song, L. Yang, H. Wang, and Y. Wang, “Dynamic Neural Networks: A Survey,” IEEE Trans. Pattern Anal. Mach. Intell., vol. 44, no. 11, pp. 7436–7456, 2022, doi: 10.1109/TPAMI.2021.3117837.</w:t>
+      </w:r>
+    </w:p>
+    <w:p>
+      <w:pPr>
+        <w:spacing w:before="0" w:after="60" w:line="240" w:lineRule="auto"/>
+        <w:ind w:left="360" w:hanging="360"/>
+      </w:pPr>
+      <w:r>
+        <w:rPr>
+          <w:rFonts w:ascii="Calibri" w:hAnsi="Calibri" w:eastAsia="宋体"/>
+          <w:sz w:val="17"/>
+        </w:rPr>
+        <w:t>[17] A. Radford et al., “Learning Transferable Visual Models From Natural Language Supervision,” in Proc. Int. Conf. Mach. Learn. (ICML), 2021, pp. 8748–8763.</w:t>
+      </w:r>
+    </w:p>
+    <w:p>
+      <w:pPr>
+        <w:spacing w:before="0" w:after="60" w:line="240" w:lineRule="auto"/>
+        <w:ind w:left="360" w:hanging="360"/>
+      </w:pPr>
+      <w:r>
+        <w:rPr>
+          <w:rFonts w:ascii="Calibri" w:hAnsi="Calibri" w:eastAsia="宋体"/>
+          <w:sz w:val="17"/>
+        </w:rPr>
+        <w:t>[18] M. Oquab et al., “DINOv2: Learning Robust Visual Features Without Supervision,” Trans. Mach. Learn. Res., 2023.</w:t>
+      </w:r>
+    </w:p>
+    <w:p>
+      <w:pPr>
+        <w:spacing w:before="0" w:after="60" w:line="240" w:lineRule="auto"/>
+        <w:ind w:left="360" w:hanging="360"/>
+      </w:pPr>
+      <w:r>
+        <w:rPr>
+          <w:rFonts w:ascii="Calibri" w:hAnsi="Calibri" w:eastAsia="宋体"/>
+          <w:sz w:val="17"/>
+        </w:rPr>
+        <w:t>[19] B. Zheng, N. Ma, S. Tong, and S. Xie, “Diffusion Transformers With Representation Autoencoders,” arXiv:2510.11690, 2025.</w:t>
+      </w:r>
+    </w:p>
+    <w:p>
+      <w:pPr>
+        <w:spacing w:before="0" w:after="60" w:line="240" w:lineRule="auto"/>
+        <w:ind w:left="360" w:hanging="360"/>
+      </w:pPr>
+      <w:r>
+        <w:rPr>
+          <w:rFonts w:ascii="Calibri" w:hAnsi="Calibri" w:eastAsia="宋体"/>
+          <w:sz w:val="17"/>
+        </w:rPr>
+        <w:t>[20] S. Ross, G. Gordon, and D. Bagnell, “A Reduction of Imitation Learning and Structured Prediction to No-Regret Online Learning,” in Proc. Int. Conf. Artif. Intell. Stat. (AISTATS), 2011, pp. 627–635.</w:t>
+      </w:r>
+    </w:p>
+    <w:p>
+      <w:pPr>
+        <w:spacing w:before="0" w:after="60" w:line="240" w:lineRule="auto"/>
+        <w:ind w:left="360" w:hanging="360"/>
+      </w:pPr>
+      <w:r>
+        <w:rPr>
+          <w:rFonts w:ascii="Calibri" w:hAnsi="Calibri" w:eastAsia="宋体"/>
+          <w:sz w:val="17"/>
+        </w:rPr>
+        <w:t>[21] J. Schulman, F. Wolski, P. Dhariwal, A. Radford, and O. Klimov, “Proximal Policy Optimization Algorithms,” arXiv:1707.06347, 2017.</w:t>
+      </w:r>
+    </w:p>
+    <w:p>
+      <w:pPr>
+        <w:spacing w:before="0" w:after="60" w:line="240" w:lineRule="auto"/>
+        <w:ind w:left="360" w:hanging="360"/>
+      </w:pPr>
+      <w:r>
+        <w:rPr>
+          <w:rFonts w:ascii="Calibri" w:hAnsi="Calibri" w:eastAsia="宋体"/>
+          <w:sz w:val="17"/>
+        </w:rPr>
+        <w:t>[22] Z. Shao et al., “DeepSeekMath: Pushing the Limits of Mathematical Reasoning in Open Language Models,” arXiv:2402.03300, 2024.</w:t>
+      </w:r>
+    </w:p>
+    <w:p>
+      <w:pPr>
+        <w:spacing w:before="0" w:after="60" w:line="240" w:lineRule="auto"/>
+        <w:ind w:left="360" w:hanging="360"/>
+      </w:pPr>
+      <w:r>
+        <w:rPr>
+          <w:rFonts w:ascii="Calibri" w:hAnsi="Calibri" w:eastAsia="宋体"/>
+          <w:sz w:val="17"/>
+        </w:rPr>
+        <w:t>[23] J. Li, C. Wan, S. Dong, C. Ding, Q. Wang, Z. Ma, and Y. Gong, “Trajectory-Diversity-Driven Robust Vision-and-Language Navigation,” arXiv:2603.15370, 2026.</w:t>
+      </w:r>
+    </w:p>
+    <w:p>
+      <w:pPr>
+        <w:spacing w:before="0" w:after="60" w:line="240" w:lineRule="auto"/>
+        <w:ind w:left="360" w:hanging="360"/>
+      </w:pPr>
+      <w:r>
+        <w:rPr>
+          <w:rFonts w:ascii="Calibri" w:hAnsi="Calibri" w:eastAsia="宋体"/>
+          <w:sz w:val="17"/>
+        </w:rPr>
+        <w:t>[24] G. Zhou, Y. Hong, and Q. Wu, “NavGPT: Explicit Reasoning in Vision-and-Language Navigation With Large Language Models,” Proc. AAAI Conf. Artif. Intell., vol. 38, no. 7, pp. 7641–7649, 2024.</w:t>
+      </w:r>
+    </w:p>
+    <w:p>
+      <w:pPr>
+        <w:spacing w:before="0" w:after="60" w:line="240" w:lineRule="auto"/>
+        <w:ind w:left="360" w:hanging="360"/>
+      </w:pPr>
+      <w:r>
+        <w:rPr>
+          <w:rFonts w:ascii="Calibri" w:hAnsi="Calibri" w:eastAsia="宋体"/>
+          <w:sz w:val="17"/>
+        </w:rPr>
+        <w:t>[25] J. Chen, B. Lin, R. Xu, Z. Chai, X. Liang, and K.-Y. K. Wong, “MapGPT: Map-Guided Prompting With Adaptive Path Planning for Vision-and-Language Navigation,” in Proc. Annu. Meeting Assoc. Comput. Linguistics (ACL), 2024, pp. 9796–9810.</w:t>
+      </w:r>
+    </w:p>
+    <w:p>
+      <w:pPr>
+        <w:spacing w:before="0" w:after="60" w:line="240" w:lineRule="auto"/>
+        <w:ind w:left="360" w:hanging="360"/>
+      </w:pPr>
+      <w:r>
+        <w:rPr>
+          <w:rFonts w:ascii="Calibri" w:hAnsi="Calibri" w:eastAsia="宋体"/>
+          <w:sz w:val="17"/>
+        </w:rPr>
+        <w:t>[26] G. Zhou, Y. Hong, Z. Wang, X. E. Wang, and Q. Wu, “NavGPT-2: Unleashing Navigational Reasoning Capability for Large Vision-Language Models,” in Proc. Eur. Conf. Comput. Vis. (ECCV), 2024, pp. 260–278.</w:t>
+      </w:r>
+    </w:p>
+    <w:p>
+      <w:pPr>
+        <w:spacing w:before="0" w:after="60" w:line="240" w:lineRule="auto"/>
+        <w:ind w:left="360" w:hanging="360"/>
+      </w:pPr>
+      <w:r>
+        <w:rPr>
+          <w:rFonts w:ascii="Calibri" w:hAnsi="Calibri" w:eastAsia="宋体"/>
+          <w:sz w:val="17"/>
+        </w:rPr>
+        <w:t>[27] J. Zhang et al., “NaVid: Video-Based VLM Plans the Next Step for Vision-and-Language Navigation,” in Proc. Robot. Sci. Syst. (RSS), 2024.</w:t>
       </w:r>
     </w:p>
     <w:sectPr>
@@ -16160,7 +16386,7 @@
     <w:lsdException w:uiPriority="99" w:name="footnote text"/>
     <w:lsdException w:uiPriority="99" w:name="annotation text"/>
     <w:lsdException w:qFormat="1" w:uiPriority="99" w:semiHidden="0" w:name="header"/>
-    <w:lsdException w:uiPriority="99" w:semiHidden="0" w:name="footer"/>
+    <w:lsdException w:qFormat="1" w:uiPriority="99" w:semiHidden="0" w:name="footer"/>
     <w:lsdException w:uiPriority="99" w:name="index heading"/>
     <w:lsdException w:qFormat="1" w:uiPriority="35" w:name="caption"/>
     <w:lsdException w:uiPriority="99" w:name="table of figures"/>
@@ -16194,7 +16420,7 @@
     <w:lsdException w:uiPriority="99" w:name="Closing"/>
     <w:lsdException w:uiPriority="99" w:name="Signature"/>
     <w:lsdException w:uiPriority="1" w:name="Default Paragraph Font"/>
-    <w:lsdException w:uiPriority="99" w:semiHidden="0" w:name="Body Text"/>
+    <w:lsdException w:qFormat="1" w:uiPriority="99" w:semiHidden="0" w:name="Body Text"/>
     <w:lsdException w:uiPriority="99" w:name="Body Text Indent"/>
     <w:lsdException w:qFormat="1" w:uiPriority="99" w:semiHidden="0" w:name="List Continue"/>
     <w:lsdException w:qFormat="1" w:uiPriority="99" w:semiHidden="0" w:name="List Continue 2"/>
@@ -16402,7 +16628,7 @@
     <w:name w:val="heading 1"/>
     <w:basedOn w:val="1"/>
     <w:next w:val="1"/>
-    <w:link w:val="138"/>
+    <w:link w:val="139"/>
     <w:qFormat/>
     <w:uiPriority w:val="9"/>
     <w:pPr>
@@ -16424,7 +16650,7 @@
     <w:name w:val="heading 2"/>
     <w:basedOn w:val="1"/>
     <w:next w:val="1"/>
-    <w:link w:val="139"/>
+    <w:link w:val="140"/>
     <w:unhideWhenUsed/>
     <w:qFormat/>
     <w:uiPriority w:val="9"/>
@@ -16447,7 +16673,7 @@
     <w:name w:val="heading 3"/>
     <w:basedOn w:val="1"/>
     <w:next w:val="1"/>
-    <w:link w:val="140"/>
+    <w:link w:val="141"/>
     <w:unhideWhenUsed/>
     <w:qFormat/>
     <w:uiPriority w:val="9"/>
@@ -16469,7 +16695,7 @@
     <w:name w:val="heading 4"/>
     <w:basedOn w:val="1"/>
     <w:next w:val="1"/>
-    <w:link w:val="150"/>
+    <w:link w:val="151"/>
     <w:semiHidden/>
     <w:unhideWhenUsed/>
     <w:qFormat/>
@@ -16498,7 +16724,7 @@
     <w:name w:val="heading 5"/>
     <w:basedOn w:val="1"/>
     <w:next w:val="1"/>
-    <w:link w:val="151"/>
+    <w:link w:val="152"/>
     <w:semiHidden/>
     <w:unhideWhenUsed/>
     <w:qFormat/>
@@ -16518,7 +16744,7 @@
     <w:name w:val="heading 6"/>
     <w:basedOn w:val="1"/>
     <w:next w:val="1"/>
-    <w:link w:val="152"/>
+    <w:link w:val="153"/>
     <w:semiHidden/>
     <w:unhideWhenUsed/>
     <w:qFormat/>
@@ -16540,7 +16766,7 @@
     <w:name w:val="heading 7"/>
     <w:basedOn w:val="1"/>
     <w:next w:val="1"/>
-    <w:link w:val="153"/>
+    <w:link w:val="154"/>
     <w:semiHidden/>
     <w:unhideWhenUsed/>
     <w:qFormat/>
@@ -16570,7 +16796,7 @@
     <w:name w:val="heading 8"/>
     <w:basedOn w:val="1"/>
     <w:next w:val="1"/>
-    <w:link w:val="154"/>
+    <w:link w:val="155"/>
     <w:semiHidden/>
     <w:unhideWhenUsed/>
     <w:qFormat/>
@@ -16597,7 +16823,7 @@
     <w:name w:val="heading 9"/>
     <w:basedOn w:val="1"/>
     <w:next w:val="1"/>
-    <w:link w:val="155"/>
+    <w:link w:val="156"/>
     <w:semiHidden/>
     <w:unhideWhenUsed/>
     <w:qFormat/>
@@ -16625,13 +16851,13 @@
       </w14:textFill>
     </w:rPr>
   </w:style>
-  <w:style w:type="character" w:default="1" w:styleId="132">
+  <w:style w:type="character" w:default="1" w:styleId="133">
     <w:name w:val="Default Paragraph Font"/>
     <w:semiHidden/>
     <w:unhideWhenUsed/>
     <w:uiPriority w:val="1"/>
   </w:style>
-  <w:style w:type="table" w:default="1" w:styleId="32">
+  <w:style w:type="table" w:default="1" w:styleId="33">
     <w:name w:val="Normal Table"/>
     <w:semiHidden/>
     <w:unhideWhenUsed/>
@@ -16647,7 +16873,7 @@
   </w:style>
   <w:style w:type="paragraph" w:styleId="2">
     <w:name w:val="macro"/>
-    <w:link w:val="147"/>
+    <w:link w:val="148"/>
     <w:unhideWhenUsed/>
     <w:qFormat/>
     <w:uiPriority w:val="99"/>
@@ -16759,7 +16985,7 @@
   <w:style w:type="paragraph" w:styleId="17">
     <w:name w:val="Body Text 3"/>
     <w:basedOn w:val="1"/>
-    <w:link w:val="146"/>
+    <w:link w:val="147"/>
     <w:unhideWhenUsed/>
     <w:uiPriority w:val="99"/>
     <w:pPr>
@@ -16787,8 +17013,9 @@
   <w:style w:type="paragraph" w:styleId="19">
     <w:name w:val="Body Text"/>
     <w:basedOn w:val="1"/>
-    <w:link w:val="144"/>
+    <w:link w:val="145"/>
     <w:unhideWhenUsed/>
+    <w:qFormat/>
     <w:uiPriority w:val="99"/>
     <w:pPr>
       <w:spacing w:after="120"/>
@@ -16848,8 +17075,9 @@
   <w:style w:type="paragraph" w:styleId="24">
     <w:name w:val="footer"/>
     <w:basedOn w:val="1"/>
-    <w:link w:val="136"/>
+    <w:link w:val="137"/>
     <w:unhideWhenUsed/>
+    <w:qFormat/>
     <w:uiPriority w:val="99"/>
     <w:pPr>
       <w:tabs>
@@ -16862,7 +17090,7 @@
   <w:style w:type="paragraph" w:styleId="25">
     <w:name w:val="header"/>
     <w:basedOn w:val="1"/>
-    <w:link w:val="135"/>
+    <w:link w:val="136"/>
     <w:unhideWhenUsed/>
     <w:qFormat/>
     <w:uiPriority w:val="99"/>
@@ -16878,7 +17106,7 @@
     <w:name w:val="Subtitle"/>
     <w:basedOn w:val="1"/>
     <w:next w:val="1"/>
-    <w:link w:val="142"/>
+    <w:link w:val="143"/>
     <w:qFormat/>
     <w:uiPriority w:val="11"/>
     <w:pPr>
@@ -16908,7 +17136,7 @@
   <w:style w:type="paragraph" w:styleId="28">
     <w:name w:val="Body Text 2"/>
     <w:basedOn w:val="1"/>
-    <w:link w:val="145"/>
+    <w:link w:val="146"/>
     <w:unhideWhenUsed/>
     <w:qFormat/>
     <w:uiPriority w:val="99"/>
@@ -16929,6 +17157,23 @@
     </w:pPr>
   </w:style>
   <w:style w:type="paragraph" w:styleId="30">
+    <w:name w:val="Normal (Web)"/>
+    <w:basedOn w:val="1"/>
+    <w:semiHidden/>
+    <w:unhideWhenUsed/>
+    <w:uiPriority w:val="99"/>
+    <w:pPr>
+      <w:spacing w:before="0" w:beforeAutospacing="1" w:after="0" w:afterAutospacing="1"/>
+      <w:ind w:left="0" w:right="0"/>
+      <w:jc w:val="left"/>
+    </w:pPr>
+    <w:rPr>
+      <w:kern w:val="0"/>
+      <w:sz w:val="24"/>
+      <w:lang w:val="en-US" w:eastAsia="zh-CN" w:bidi="ar"/>
+    </w:rPr>
+  </w:style>
+  <w:style w:type="paragraph" w:styleId="31">
     <w:name w:val="List Continue 3"/>
     <w:basedOn w:val="1"/>
     <w:unhideWhenUsed/>
@@ -16940,11 +17185,11 @@
       <w:contextualSpacing/>
     </w:pPr>
   </w:style>
-  <w:style w:type="paragraph" w:styleId="31">
+  <w:style w:type="paragraph" w:styleId="32">
     <w:name w:val="Title"/>
     <w:basedOn w:val="1"/>
     <w:next w:val="1"/>
-    <w:link w:val="141"/>
+    <w:link w:val="142"/>
     <w:qFormat/>
     <w:uiPriority w:val="10"/>
     <w:pPr>
@@ -16964,9 +17209,9 @@
       <w:szCs w:val="52"/>
     </w:rPr>
   </w:style>
-  <w:style w:type="table" w:styleId="33">
+  <w:style w:type="table" w:styleId="34">
     <w:name w:val="Table Grid"/>
-    <w:basedOn w:val="32"/>
+    <w:basedOn w:val="33"/>
     <w:qFormat/>
     <w:uiPriority w:val="59"/>
     <w:pPr>
@@ -16989,9 +17234,9 @@
       </w:tblCellMar>
     </w:tblPr>
   </w:style>
-  <w:style w:type="table" w:styleId="34">
+  <w:style w:type="table" w:styleId="35">
     <w:name w:val="Light Shading"/>
-    <w:basedOn w:val="32"/>
+    <w:basedOn w:val="33"/>
     <w:qFormat/>
     <w:uiPriority w:val="60"/>
     <w:pPr>
@@ -17089,9 +17334,9 @@
       </w:tcPr>
     </w:tblStylePr>
   </w:style>
-  <w:style w:type="table" w:styleId="35">
+  <w:style w:type="table" w:styleId="36">
     <w:name w:val="Light Shading Accent 1"/>
-    <w:basedOn w:val="32"/>
+    <w:basedOn w:val="33"/>
     <w:qFormat/>
     <w:uiPriority w:val="60"/>
     <w:pPr>
@@ -17189,9 +17434,9 @@
       </w:tcPr>
     </w:tblStylePr>
   </w:style>
-  <w:style w:type="table" w:styleId="36">
+  <w:style w:type="table" w:styleId="37">
     <w:name w:val="Light Shading Accent 2"/>
-    <w:basedOn w:val="32"/>
+    <w:basedOn w:val="33"/>
     <w:qFormat/>
     <w:uiPriority w:val="60"/>
     <w:pPr>
@@ -17289,9 +17534,9 @@
       </w:tcPr>
     </w:tblStylePr>
   </w:style>
-  <w:style w:type="table" w:styleId="37">
+  <w:style w:type="table" w:styleId="38">
     <w:name w:val="Light Shading Accent 3"/>
-    <w:basedOn w:val="32"/>
+    <w:basedOn w:val="33"/>
     <w:qFormat/>
     <w:uiPriority w:val="60"/>
     <w:pPr>
@@ -17389,9 +17634,9 @@
       </w:tcPr>
     </w:tblStylePr>
   </w:style>
-  <w:style w:type="table" w:styleId="38">
+  <w:style w:type="table" w:styleId="39">
     <w:name w:val="Light Shading Accent 4"/>
-    <w:basedOn w:val="32"/>
+    <w:basedOn w:val="33"/>
     <w:qFormat/>
     <w:uiPriority w:val="60"/>
     <w:pPr>
@@ -17489,9 +17734,9 @@
       </w:tcPr>
     </w:tblStylePr>
   </w:style>
-  <w:style w:type="table" w:styleId="39">
+  <w:style w:type="table" w:styleId="40">
     <w:name w:val="Light Shading Accent 5"/>
-    <w:basedOn w:val="32"/>
+    <w:basedOn w:val="33"/>
     <w:qFormat/>
     <w:uiPriority w:val="60"/>
     <w:pPr>
@@ -17589,9 +17834,9 @@
       </w:tcPr>
     </w:tblStylePr>
   </w:style>
-  <w:style w:type="table" w:styleId="40">
+  <w:style w:type="table" w:styleId="41">
     <w:name w:val="Light Shading Accent 6"/>
-    <w:basedOn w:val="32"/>
+    <w:basedOn w:val="33"/>
     <w:qFormat/>
     <w:uiPriority w:val="60"/>
     <w:pPr>
@@ -17689,9 +17934,9 @@
       </w:tcPr>
     </w:tblStylePr>
   </w:style>
-  <w:style w:type="table" w:styleId="41">
+  <w:style w:type="table" w:styleId="42">
     <w:name w:val="Light List"/>
-    <w:basedOn w:val="32"/>
+    <w:basedOn w:val="33"/>
     <w:qFormat/>
     <w:uiPriority w:val="61"/>
     <w:pPr>
@@ -17783,9 +18028,9 @@
       </w:tcPr>
     </w:tblStylePr>
   </w:style>
-  <w:style w:type="table" w:styleId="42">
+  <w:style w:type="table" w:styleId="43">
     <w:name w:val="Light List Accent 1"/>
-    <w:basedOn w:val="32"/>
+    <w:basedOn w:val="33"/>
     <w:qFormat/>
     <w:uiPriority w:val="61"/>
     <w:pPr>
@@ -17877,9 +18122,9 @@
       </w:tcPr>
     </w:tblStylePr>
   </w:style>
-  <w:style w:type="table" w:styleId="43">
+  <w:style w:type="table" w:styleId="44">
     <w:name w:val="Light List Accent 2"/>
-    <w:basedOn w:val="32"/>
+    <w:basedOn w:val="33"/>
     <w:qFormat/>
     <w:uiPriority w:val="61"/>
     <w:pPr>
@@ -17971,9 +18216,9 @@
       </w:tcPr>
     </w:tblStylePr>
   </w:style>
-  <w:style w:type="table" w:styleId="44">
+  <w:style w:type="table" w:styleId="45">
     <w:name w:val="Light List Accent 3"/>
-    <w:basedOn w:val="32"/>
+    <w:basedOn w:val="33"/>
     <w:qFormat/>
     <w:uiPriority w:val="61"/>
     <w:pPr>
@@ -18065,9 +18310,9 @@
       </w:tcPr>
     </w:tblStylePr>
   </w:style>
-  <w:style w:type="table" w:styleId="45">
+  <w:style w:type="table" w:styleId="46">
     <w:name w:val="Light List Accent 4"/>
-    <w:basedOn w:val="32"/>
+    <w:basedOn w:val="33"/>
     <w:qFormat/>
     <w:uiPriority w:val="61"/>
     <w:pPr>
@@ -18159,9 +18404,9 @@
       </w:tcPr>
     </w:tblStylePr>
   </w:style>
-  <w:style w:type="table" w:styleId="46">
+  <w:style w:type="table" w:styleId="47">
     <w:name w:val="Light List Accent 5"/>
-    <w:basedOn w:val="32"/>
+    <w:basedOn w:val="33"/>
     <w:qFormat/>
     <w:uiPriority w:val="61"/>
     <w:pPr>
@@ -18253,9 +18498,9 @@
       </w:tcPr>
     </w:tblStylePr>
   </w:style>
-  <w:style w:type="table" w:styleId="47">
+  <w:style w:type="table" w:styleId="48">
     <w:name w:val="Light List Accent 6"/>
-    <w:basedOn w:val="32"/>
+    <w:basedOn w:val="33"/>
     <w:qFormat/>
     <w:uiPriority w:val="61"/>
     <w:pPr>
@@ -18347,9 +18592,9 @@
       </w:tcPr>
     </w:tblStylePr>
   </w:style>
-  <w:style w:type="table" w:styleId="48">
+  <w:style w:type="table" w:styleId="49">
     <w:name w:val="Light Grid"/>
-    <w:basedOn w:val="32"/>
+    <w:basedOn w:val="33"/>
     <w:qFormat/>
     <w:uiPriority w:val="62"/>
     <w:pPr>
@@ -18474,9 +18719,9 @@
       </w:tcPr>
     </w:tblStylePr>
   </w:style>
-  <w:style w:type="table" w:styleId="49">
+  <w:style w:type="table" w:styleId="50">
     <w:name w:val="Light Grid Accent 1"/>
-    <w:basedOn w:val="32"/>
+    <w:basedOn w:val="33"/>
     <w:qFormat/>
     <w:uiPriority w:val="62"/>
     <w:pPr>
@@ -18601,9 +18846,9 @@
       </w:tcPr>
     </w:tblStylePr>
   </w:style>
-  <w:style w:type="table" w:styleId="50">
+  <w:style w:type="table" w:styleId="51">
     <w:name w:val="Light Grid Accent 2"/>
-    <w:basedOn w:val="32"/>
+    <w:basedOn w:val="33"/>
     <w:qFormat/>
     <w:uiPriority w:val="62"/>
     <w:pPr>
@@ -18728,9 +18973,9 @@
       </w:tcPr>
     </w:tblStylePr>
   </w:style>
-  <w:style w:type="table" w:styleId="51">
+  <w:style w:type="table" w:styleId="52">
     <w:name w:val="Light Grid Accent 3"/>
-    <w:basedOn w:val="32"/>
+    <w:basedOn w:val="33"/>
     <w:qFormat/>
     <w:uiPriority w:val="62"/>
     <w:pPr>
@@ -18855,9 +19100,9 @@
       </w:tcPr>
     </w:tblStylePr>
   </w:style>
-  <w:style w:type="table" w:styleId="52">
+  <w:style w:type="table" w:styleId="53">
     <w:name w:val="Light Grid Accent 4"/>
-    <w:basedOn w:val="32"/>
+    <w:basedOn w:val="33"/>
     <w:qFormat/>
     <w:uiPriority w:val="62"/>
     <w:pPr>
@@ -18982,9 +19227,9 @@
       </w:tcPr>
     </w:tblStylePr>
   </w:style>
-  <w:style w:type="table" w:styleId="53">
+  <w:style w:type="table" w:styleId="54">
     <w:name w:val="Light Grid Accent 5"/>
-    <w:basedOn w:val="32"/>
+    <w:basedOn w:val="33"/>
     <w:qFormat/>
     <w:uiPriority w:val="62"/>
     <w:pPr>
@@ -19109,9 +19354,9 @@
       </w:tcPr>
     </w:tblStylePr>
   </w:style>
-  <w:style w:type="table" w:styleId="54">
+  <w:style w:type="table" w:styleId="55">
     <w:name w:val="Light Grid Accent 6"/>
-    <w:basedOn w:val="32"/>
+    <w:basedOn w:val="33"/>
     <w:qFormat/>
     <w:uiPriority w:val="62"/>
     <w:pPr>
@@ -19236,9 +19481,9 @@
       </w:tcPr>
     </w:tblStylePr>
   </w:style>
-  <w:style w:type="table" w:styleId="55">
+  <w:style w:type="table" w:styleId="56">
     <w:name w:val="Medium Shading 1"/>
-    <w:basedOn w:val="32"/>
+    <w:basedOn w:val="33"/>
     <w:qFormat/>
     <w:uiPriority w:val="63"/>
     <w:pPr>
@@ -19344,9 +19589,9 @@
       </w:tcPr>
     </w:tblStylePr>
   </w:style>
-  <w:style w:type="table" w:styleId="56">
+  <w:style w:type="table" w:styleId="57">
     <w:name w:val="Medium Shading 1 Accent 1"/>
-    <w:basedOn w:val="32"/>
+    <w:basedOn w:val="33"/>
     <w:qFormat/>
     <w:uiPriority w:val="63"/>
     <w:pPr>
@@ -19452,9 +19697,9 @@
       </w:tcPr>
     </w:tblStylePr>
   </w:style>
-  <w:style w:type="table" w:styleId="57">
+  <w:style w:type="table" w:styleId="58">
     <w:name w:val="Medium Shading 1 Accent 2"/>
-    <w:basedOn w:val="32"/>
+    <w:basedOn w:val="33"/>
     <w:qFormat/>
     <w:uiPriority w:val="63"/>
     <w:pPr>
@@ -19560,9 +19805,9 @@
       </w:tcPr>
     </w:tblStylePr>
   </w:style>
-  <w:style w:type="table" w:styleId="58">
+  <w:style w:type="table" w:styleId="59">
     <w:name w:val="Medium Shading 1 Accent 3"/>
-    <w:basedOn w:val="32"/>
+    <w:basedOn w:val="33"/>
     <w:qFormat/>
     <w:uiPriority w:val="63"/>
     <w:pPr>
@@ -19668,9 +19913,9 @@
       </w:tcPr>
     </w:tblStylePr>
   </w:style>
-  <w:style w:type="table" w:styleId="59">
+  <w:style w:type="table" w:styleId="60">
     <w:name w:val="Medium Shading 1 Accent 4"/>
-    <w:basedOn w:val="32"/>
+    <w:basedOn w:val="33"/>
     <w:qFormat/>
     <w:uiPriority w:val="63"/>
     <w:pPr>
@@ -19776,9 +20021,9 @@
       </w:tcPr>
     </w:tblStylePr>
   </w:style>
-  <w:style w:type="table" w:styleId="60">
+  <w:style w:type="table" w:styleId="61">
     <w:name w:val="Medium Shading 1 Accent 5"/>
-    <w:basedOn w:val="32"/>
+    <w:basedOn w:val="33"/>
     <w:qFormat/>
     <w:uiPriority w:val="63"/>
     <w:pPr>
@@ -19884,9 +20129,9 @@
       </w:tcPr>
     </w:tblStylePr>
   </w:style>
-  <w:style w:type="table" w:styleId="61">
+  <w:style w:type="table" w:styleId="62">
     <w:name w:val="Medium Shading 1 Accent 6"/>
-    <w:basedOn w:val="32"/>
+    <w:basedOn w:val="33"/>
     <w:qFormat/>
     <w:uiPriority w:val="63"/>
     <w:pPr>
@@ -19992,9 +20237,9 @@
       </w:tcPr>
     </w:tblStylePr>
   </w:style>
-  <w:style w:type="table" w:styleId="62">
+  <w:style w:type="table" w:styleId="63">
     <w:name w:val="Medium Shading 2"/>
-    <w:basedOn w:val="32"/>
+    <w:basedOn w:val="33"/>
     <w:qFormat/>
     <w:uiPriority w:val="64"/>
     <w:pPr>
@@ -20158,9 +20403,9 @@
       </w:tcPr>
     </w:tblStylePr>
   </w:style>
-  <w:style w:type="table" w:styleId="63">
+  <w:style w:type="table" w:styleId="64">
     <w:name w:val="Medium Shading 2 Accent 1"/>
-    <w:basedOn w:val="32"/>
+    <w:basedOn w:val="33"/>
     <w:qFormat/>
     <w:uiPriority w:val="64"/>
     <w:pPr>
@@ -20324,9 +20569,9 @@
       </w:tcPr>
     </w:tblStylePr>
   </w:style>
-  <w:style w:type="table" w:styleId="64">
+  <w:style w:type="table" w:styleId="65">
     <w:name w:val="Medium Shading 2 Accent 2"/>
-    <w:basedOn w:val="32"/>
+    <w:basedOn w:val="33"/>
     <w:qFormat/>
     <w:uiPriority w:val="64"/>
     <w:pPr>
@@ -20490,9 +20735,9 @@
       </w:tcPr>
     </w:tblStylePr>
   </w:style>
-  <w:style w:type="table" w:styleId="65">
+  <w:style w:type="table" w:styleId="66">
     <w:name w:val="Medium Shading 2 Accent 3"/>
-    <w:basedOn w:val="32"/>
+    <w:basedOn w:val="33"/>
     <w:qFormat/>
     <w:uiPriority w:val="64"/>
     <w:pPr>
@@ -20656,9 +20901,9 @@
       </w:tcPr>
     </w:tblStylePr>
   </w:style>
-  <w:style w:type="table" w:styleId="66">
+  <w:style w:type="table" w:styleId="67">
     <w:name w:val="Medium Shading 2 Accent 4"/>
-    <w:basedOn w:val="32"/>
+    <w:basedOn w:val="33"/>
     <w:qFormat/>
     <w:uiPriority w:val="64"/>
     <w:pPr>
@@ -20822,9 +21067,9 @@
       </w:tcPr>
     </w:tblStylePr>
   </w:style>
-  <w:style w:type="table" w:styleId="67">
+  <w:style w:type="table" w:styleId="68">
     <w:name w:val="Medium Shading 2 Accent 5"/>
-    <w:basedOn w:val="32"/>
+    <w:basedOn w:val="33"/>
     <w:qFormat/>
     <w:uiPriority w:val="64"/>
     <w:pPr>
@@ -20988,9 +21233,9 @@
       </w:tcPr>
     </w:tblStylePr>
   </w:style>
-  <w:style w:type="table" w:styleId="68">
+  <w:style w:type="table" w:styleId="69">
     <w:name w:val="Medium Shading 2 Accent 6"/>
-    <w:basedOn w:val="32"/>
+    <w:basedOn w:val="33"/>
     <w:qFormat/>
     <w:uiPriority w:val="64"/>
     <w:pPr>
@@ -21154,9 +21399,9 @@
       </w:tcPr>
     </w:tblStylePr>
   </w:style>
-  <w:style w:type="table" w:styleId="69">
+  <w:style w:type="table" w:styleId="70">
     <w:name w:val="Medium List 1"/>
-    <w:basedOn w:val="32"/>
+    <w:basedOn w:val="33"/>
     <w:qFormat/>
     <w:uiPriority w:val="65"/>
     <w:pPr>
@@ -21245,9 +21490,9 @@
       </w:tcPr>
     </w:tblStylePr>
   </w:style>
-  <w:style w:type="table" w:styleId="70">
+  <w:style w:type="table" w:styleId="71">
     <w:name w:val="Medium List 1 Accent 1"/>
-    <w:basedOn w:val="32"/>
+    <w:basedOn w:val="33"/>
     <w:qFormat/>
     <w:uiPriority w:val="65"/>
     <w:pPr>
@@ -21336,9 +21581,9 @@
       </w:tcPr>
     </w:tblStylePr>
   </w:style>
-  <w:style w:type="table" w:styleId="71">
+  <w:style w:type="table" w:styleId="72">
     <w:name w:val="Medium List 1 Accent 2"/>
-    <w:basedOn w:val="32"/>
+    <w:basedOn w:val="33"/>
     <w:qFormat/>
     <w:uiPriority w:val="65"/>
     <w:pPr>
@@ -21427,9 +21672,9 @@
       </w:tcPr>
     </w:tblStylePr>
   </w:style>
-  <w:style w:type="table" w:styleId="72">
+  <w:style w:type="table" w:styleId="73">
     <w:name w:val="Medium List 1 Accent 3"/>
-    <w:basedOn w:val="32"/>
+    <w:basedOn w:val="33"/>
     <w:qFormat/>
     <w:uiPriority w:val="65"/>
     <w:pPr>
@@ -21518,9 +21763,9 @@
       </w:tcPr>
     </w:tblStylePr>
   </w:style>
-  <w:style w:type="table" w:styleId="73">
+  <w:style w:type="table" w:styleId="74">
     <w:name w:val="Medium List 1 Accent 4"/>
-    <w:basedOn w:val="32"/>
+    <w:basedOn w:val="33"/>
     <w:qFormat/>
     <w:uiPriority w:val="65"/>
     <w:pPr>
@@ -21609,9 +21854,9 @@
       </w:tcPr>
     </w:tblStylePr>
   </w:style>
-  <w:style w:type="table" w:styleId="74">
+  <w:style w:type="table" w:styleId="75">
     <w:name w:val="Medium List 1 Accent 5"/>
-    <w:basedOn w:val="32"/>
+    <w:basedOn w:val="33"/>
     <w:qFormat/>
     <w:uiPriority w:val="65"/>
     <w:pPr>
@@ -21700,9 +21945,9 @@
       </w:tcPr>
     </w:tblStylePr>
   </w:style>
-  <w:style w:type="table" w:styleId="75">
+  <w:style w:type="table" w:styleId="76">
     <w:name w:val="Medium List 1 Accent 6"/>
-    <w:basedOn w:val="32"/>
+    <w:basedOn w:val="33"/>
     <w:qFormat/>
     <w:uiPriority w:val="65"/>
     <w:pPr>
@@ -21791,9 +22036,9 @@
       </w:tcPr>
     </w:tblStylePr>
   </w:style>
-  <w:style w:type="table" w:styleId="76">
+  <w:style w:type="table" w:styleId="77">
     <w:name w:val="Medium List 2"/>
-    <w:basedOn w:val="32"/>
+    <w:basedOn w:val="33"/>
     <w:qFormat/>
     <w:uiPriority w:val="66"/>
     <w:pPr>
@@ -21921,9 +22166,9 @@
       </w:tcPr>
     </w:tblStylePr>
   </w:style>
-  <w:style w:type="table" w:styleId="77">
+  <w:style w:type="table" w:styleId="78">
     <w:name w:val="Medium List 2 Accent 1"/>
-    <w:basedOn w:val="32"/>
+    <w:basedOn w:val="33"/>
     <w:qFormat/>
     <w:uiPriority w:val="66"/>
     <w:pPr>
@@ -22051,9 +22296,9 @@
       </w:tcPr>
     </w:tblStylePr>
   </w:style>
-  <w:style w:type="table" w:styleId="78">
+  <w:style w:type="table" w:styleId="79">
     <w:name w:val="Medium List 2 Accent 2"/>
-    <w:basedOn w:val="32"/>
+    <w:basedOn w:val="33"/>
     <w:qFormat/>
     <w:uiPriority w:val="66"/>
     <w:pPr>
@@ -22181,9 +22426,9 @@
       </w:tcPr>
     </w:tblStylePr>
   </w:style>
-  <w:style w:type="table" w:styleId="79">
+  <w:style w:type="table" w:styleId="80">
     <w:name w:val="Medium List 2 Accent 3"/>
-    <w:basedOn w:val="32"/>
+    <w:basedOn w:val="33"/>
     <w:qFormat/>
     <w:uiPriority w:val="66"/>
     <w:pPr>
@@ -22311,9 +22556,9 @@
       </w:tcPr>
     </w:tblStylePr>
   </w:style>
-  <w:style w:type="table" w:styleId="80">
+  <w:style w:type="table" w:styleId="81">
     <w:name w:val="Medium List 2 Accent 4"/>
-    <w:basedOn w:val="32"/>
+    <w:basedOn w:val="33"/>
     <w:qFormat/>
     <w:uiPriority w:val="66"/>
     <w:pPr>
@@ -22441,9 +22686,9 @@
       </w:tcPr>
     </w:tblStylePr>
   </w:style>
-  <w:style w:type="table" w:styleId="81">
+  <w:style w:type="table" w:styleId="82">
     <w:name w:val="Medium List 2 Accent 5"/>
-    <w:basedOn w:val="32"/>
+    <w:basedOn w:val="33"/>
     <w:qFormat/>
     <w:uiPriority w:val="66"/>
     <w:pPr>
@@ -22571,9 +22816,9 @@
       </w:tcPr>
     </w:tblStylePr>
   </w:style>
-  <w:style w:type="table" w:styleId="82">
+  <w:style w:type="table" w:styleId="83">
     <w:name w:val="Medium List 2 Accent 6"/>
-    <w:basedOn w:val="32"/>
+    <w:basedOn w:val="33"/>
     <w:qFormat/>
     <w:uiPriority w:val="66"/>
     <w:pPr>
@@ -22701,9 +22946,9 @@
       </w:tcPr>
     </w:tblStylePr>
   </w:style>
-  <w:style w:type="table" w:styleId="83">
+  <w:style w:type="table" w:styleId="84">
     <w:name w:val="Medium Grid 1"/>
-    <w:basedOn w:val="32"/>
+    <w:basedOn w:val="33"/>
     <w:qFormat/>
     <w:uiPriority w:val="67"/>
     <w:pPr>
@@ -22771,9 +23016,9 @@
       </w:tcPr>
     </w:tblStylePr>
   </w:style>
-  <w:style w:type="table" w:styleId="84">
+  <w:style w:type="table" w:styleId="85">
     <w:name w:val="Medium Grid 1 Accent 1"/>
-    <w:basedOn w:val="32"/>
+    <w:basedOn w:val="33"/>
     <w:qFormat/>
     <w:uiPriority w:val="67"/>
     <w:pPr>
@@ -22841,9 +23086,9 @@
       </w:tcPr>
     </w:tblStylePr>
   </w:style>
-  <w:style w:type="table" w:styleId="85">
+  <w:style w:type="table" w:styleId="86">
     <w:name w:val="Medium Grid 1 Accent 2"/>
-    <w:basedOn w:val="32"/>
+    <w:basedOn w:val="33"/>
     <w:qFormat/>
     <w:uiPriority w:val="67"/>
     <w:pPr>
@@ -22911,9 +23156,9 @@
       </w:tcPr>
     </w:tblStylePr>
   </w:style>
-  <w:style w:type="table" w:styleId="86">
+  <w:style w:type="table" w:styleId="87">
     <w:name w:val="Medium Grid 1 Accent 3"/>
-    <w:basedOn w:val="32"/>
+    <w:basedOn w:val="33"/>
     <w:qFormat/>
     <w:uiPriority w:val="67"/>
     <w:pPr>
@@ -22981,9 +23226,9 @@
       </w:tcPr>
     </w:tblStylePr>
   </w:style>
-  <w:style w:type="table" w:styleId="87">
+  <w:style w:type="table" w:styleId="88">
     <w:name w:val="Medium Grid 1 Accent 4"/>
-    <w:basedOn w:val="32"/>
+    <w:basedOn w:val="33"/>
     <w:qFormat/>
     <w:uiPriority w:val="67"/>
     <w:pPr>
@@ -23051,9 +23296,9 @@
       </w:tcPr>
     </w:tblStylePr>
   </w:style>
-  <w:style w:type="table" w:styleId="88">
+  <w:style w:type="table" w:styleId="89">
     <w:name w:val="Medium Grid 1 Accent 5"/>
-    <w:basedOn w:val="32"/>
+    <w:basedOn w:val="33"/>
     <w:qFormat/>
     <w:uiPriority w:val="67"/>
     <w:pPr>
@@ -23121,9 +23366,9 @@
       </w:tcPr>
     </w:tblStylePr>
   </w:style>
-  <w:style w:type="table" w:styleId="89">
+  <w:style w:type="table" w:styleId="90">
     <w:name w:val="Medium Grid 1 Accent 6"/>
-    <w:basedOn w:val="32"/>
+    <w:basedOn w:val="33"/>
     <w:qFormat/>
     <w:uiPriority w:val="67"/>
     <w:pPr>
@@ -23191,9 +23436,9 @@
       </w:tcPr>
     </w:tblStylePr>
   </w:style>
-  <w:style w:type="table" w:styleId="90">
+  <w:style w:type="table" w:styleId="91">
     <w:name w:val="Medium Grid 2"/>
-    <w:basedOn w:val="32"/>
+    <w:basedOn w:val="33"/>
     <w:qFormat/>
     <w:uiPriority w:val="68"/>
     <w:pPr>
@@ -23338,9 +23583,9 @@
       </w:tcPr>
     </w:tblStylePr>
   </w:style>
-  <w:style w:type="table" w:styleId="91">
+  <w:style w:type="table" w:styleId="92">
     <w:name w:val="Medium Grid 2 Accent 1"/>
-    <w:basedOn w:val="32"/>
+    <w:basedOn w:val="33"/>
     <w:qFormat/>
     <w:uiPriority w:val="68"/>
     <w:pPr>
@@ -23485,9 +23730,9 @@
       </w:tcPr>
     </w:tblStylePr>
   </w:style>
-  <w:style w:type="table" w:styleId="92">
+  <w:style w:type="table" w:styleId="93">
     <w:name w:val="Medium Grid 2 Accent 2"/>
-    <w:basedOn w:val="32"/>
+    <w:basedOn w:val="33"/>
     <w:qFormat/>
     <w:uiPriority w:val="68"/>
     <w:pPr>
@@ -23632,9 +23877,9 @@
       </w:tcPr>
     </w:tblStylePr>
   </w:style>
-  <w:style w:type="table" w:styleId="93">
+  <w:style w:type="table" w:styleId="94">
     <w:name w:val="Medium Grid 2 Accent 3"/>
-    <w:basedOn w:val="32"/>
+    <w:basedOn w:val="33"/>
     <w:qFormat/>
     <w:uiPriority w:val="68"/>
     <w:pPr>
@@ -23779,9 +24024,9 @@
       </w:tcPr>
     </w:tblStylePr>
   </w:style>
-  <w:style w:type="table" w:styleId="94">
+  <w:style w:type="table" w:styleId="95">
     <w:name w:val="Medium Grid 2 Accent 4"/>
-    <w:basedOn w:val="32"/>
+    <w:basedOn w:val="33"/>
     <w:qFormat/>
     <w:uiPriority w:val="68"/>
     <w:pPr>
@@ -23926,9 +24171,9 @@
       </w:tcPr>
     </w:tblStylePr>
   </w:style>
-  <w:style w:type="table" w:styleId="95">
+  <w:style w:type="table" w:styleId="96">
     <w:name w:val="Medium Grid 2 Accent 5"/>
-    <w:basedOn w:val="32"/>
+    <w:basedOn w:val="33"/>
     <w:qFormat/>
     <w:uiPriority w:val="68"/>
     <w:pPr>
@@ -24073,9 +24318,9 @@
       </w:tcPr>
     </w:tblStylePr>
   </w:style>
-  <w:style w:type="table" w:styleId="96">
+  <w:style w:type="table" w:styleId="97">
     <w:name w:val="Medium Grid 2 Accent 6"/>
-    <w:basedOn w:val="32"/>
+    <w:basedOn w:val="33"/>
     <w:qFormat/>
     <w:uiPriority w:val="68"/>
     <w:pPr>
@@ -24220,9 +24465,9 @@
       </w:tcPr>
     </w:tblStylePr>
   </w:style>
-  <w:style w:type="table" w:styleId="97">
+  <w:style w:type="table" w:styleId="98">
     <w:name w:val="Medium Grid 3"/>
-    <w:basedOn w:val="32"/>
+    <w:basedOn w:val="33"/>
     <w:qFormat/>
     <w:uiPriority w:val="69"/>
     <w:pPr>
@@ -24378,9 +24623,9 @@
       </w:tcPr>
     </w:tblStylePr>
   </w:style>
-  <w:style w:type="table" w:styleId="98">
+  <w:style w:type="table" w:styleId="99">
     <w:name w:val="Medium Grid 3 Accent 1"/>
-    <w:basedOn w:val="32"/>
+    <w:basedOn w:val="33"/>
     <w:qFormat/>
     <w:uiPriority w:val="69"/>
     <w:pPr>
@@ -24536,9 +24781,9 @@
       </w:tcPr>
     </w:tblStylePr>
   </w:style>
-  <w:style w:type="table" w:styleId="99">
+  <w:style w:type="table" w:styleId="100">
     <w:name w:val="Medium Grid 3 Accent 2"/>
-    <w:basedOn w:val="32"/>
+    <w:basedOn w:val="33"/>
     <w:qFormat/>
     <w:uiPriority w:val="69"/>
     <w:pPr>
@@ -24694,9 +24939,9 @@
       </w:tcPr>
     </w:tblStylePr>
   </w:style>
-  <w:style w:type="table" w:styleId="100">
+  <w:style w:type="table" w:styleId="101">
     <w:name w:val="Medium Grid 3 Accent 3"/>
-    <w:basedOn w:val="32"/>
+    <w:basedOn w:val="33"/>
     <w:qFormat/>
     <w:uiPriority w:val="69"/>
     <w:pPr>
@@ -24852,9 +25097,9 @@
       </w:tcPr>
     </w:tblStylePr>
   </w:style>
-  <w:style w:type="table" w:styleId="101">
+  <w:style w:type="table" w:styleId="102">
     <w:name w:val="Medium Grid 3 Accent 4"/>
-    <w:basedOn w:val="32"/>
+    <w:basedOn w:val="33"/>
     <w:qFormat/>
     <w:uiPriority w:val="69"/>
     <w:pPr>
@@ -25010,9 +25255,9 @@
       </w:tcPr>
     </w:tblStylePr>
   </w:style>
-  <w:style w:type="table" w:styleId="102">
+  <w:style w:type="table" w:styleId="103">
     <w:name w:val="Medium Grid 3 Accent 5"/>
-    <w:basedOn w:val="32"/>
+    <w:basedOn w:val="33"/>
     <w:qFormat/>
     <w:uiPriority w:val="69"/>
     <w:pPr>
@@ -25168,9 +25413,9 @@
       </w:tcPr>
     </w:tblStylePr>
   </w:style>
-  <w:style w:type="table" w:styleId="103">
+  <w:style w:type="table" w:styleId="104">
     <w:name w:val="Medium Grid 3 Accent 6"/>
-    <w:basedOn w:val="32"/>
+    <w:basedOn w:val="33"/>
     <w:qFormat/>
     <w:uiPriority w:val="69"/>
     <w:pPr>
@@ -25326,9 +25571,9 @@
       </w:tcPr>
     </w:tblStylePr>
   </w:style>
-  <w:style w:type="table" w:styleId="104">
+  <w:style w:type="table" w:styleId="105">
     <w:name w:val="Dark List"/>
-    <w:basedOn w:val="32"/>
+    <w:basedOn w:val="33"/>
     <w:qFormat/>
     <w:uiPriority w:val="70"/>
     <w:pPr>
@@ -25442,9 +25687,9 @@
       </w:tcPr>
     </w:tblStylePr>
   </w:style>
-  <w:style w:type="table" w:styleId="105">
+  <w:style w:type="table" w:styleId="106">
     <w:name w:val="Dark List Accent 1"/>
-    <w:basedOn w:val="32"/>
+    <w:basedOn w:val="33"/>
     <w:qFormat/>
     <w:uiPriority w:val="70"/>
     <w:pPr>
@@ -25558,9 +25803,9 @@
       </w:tcPr>
     </w:tblStylePr>
   </w:style>
-  <w:style w:type="table" w:styleId="106">
+  <w:style w:type="table" w:styleId="107">
     <w:name w:val="Dark List Accent 2"/>
-    <w:basedOn w:val="32"/>
+    <w:basedOn w:val="33"/>
     <w:qFormat/>
     <w:uiPriority w:val="70"/>
     <w:pPr>
@@ -25674,9 +25919,9 @@
       </w:tcPr>
     </w:tblStylePr>
   </w:style>
-  <w:style w:type="table" w:styleId="107">
+  <w:style w:type="table" w:styleId="108">
     <w:name w:val="Dark List Accent 3"/>
-    <w:basedOn w:val="32"/>
+    <w:basedOn w:val="33"/>
     <w:qFormat/>
     <w:uiPriority w:val="70"/>
     <w:pPr>
@@ -25790,9 +26035,9 @@
       </w:tcPr>
     </w:tblStylePr>
   </w:style>
-  <w:style w:type="table" w:styleId="108">
+  <w:style w:type="table" w:styleId="109">
     <w:name w:val="Dark List Accent 4"/>
-    <w:basedOn w:val="32"/>
+    <w:basedOn w:val="33"/>
     <w:qFormat/>
     <w:uiPriority w:val="70"/>
     <w:pPr>
@@ -25906,9 +26151,9 @@
       </w:tcPr>
     </w:tblStylePr>
   </w:style>
-  <w:style w:type="table" w:styleId="109">
+  <w:style w:type="table" w:styleId="110">
     <w:name w:val="Dark List Accent 5"/>
-    <w:basedOn w:val="32"/>
+    <w:basedOn w:val="33"/>
     <w:qFormat/>
     <w:uiPriority w:val="70"/>
     <w:pPr>
@@ -26022,9 +26267,9 @@
       </w:tcPr>
     </w:tblStylePr>
   </w:style>
-  <w:style w:type="table" w:styleId="110">
+  <w:style w:type="table" w:styleId="111">
     <w:name w:val="Dark List Accent 6"/>
-    <w:basedOn w:val="32"/>
+    <w:basedOn w:val="33"/>
     <w:qFormat/>
     <w:uiPriority w:val="70"/>
     <w:pPr>
@@ -26138,9 +26383,9 @@
       </w:tcPr>
     </w:tblStylePr>
   </w:style>
-  <w:style w:type="table" w:styleId="111">
+  <w:style w:type="table" w:styleId="112">
     <w:name w:val="Colorful Shading"/>
-    <w:basedOn w:val="32"/>
+    <w:basedOn w:val="33"/>
     <w:qFormat/>
     <w:uiPriority w:val="71"/>
     <w:pPr>
@@ -26287,9 +26532,9 @@
       </w:rPr>
     </w:tblStylePr>
   </w:style>
-  <w:style w:type="table" w:styleId="112">
+  <w:style w:type="table" w:styleId="113">
     <w:name w:val="Colorful Shading Accent 1"/>
-    <w:basedOn w:val="32"/>
+    <w:basedOn w:val="33"/>
     <w:qFormat/>
     <w:uiPriority w:val="71"/>
     <w:pPr>
@@ -26436,9 +26681,9 @@
       </w:rPr>
     </w:tblStylePr>
   </w:style>
-  <w:style w:type="table" w:styleId="113">
+  <w:style w:type="table" w:styleId="114">
     <w:name w:val="Colorful Shading Accent 2"/>
-    <w:basedOn w:val="32"/>
+    <w:basedOn w:val="33"/>
     <w:qFormat/>
     <w:uiPriority w:val="71"/>
     <w:pPr>
@@ -26585,9 +26830,9 @@
       </w:rPr>
     </w:tblStylePr>
   </w:style>
-  <w:style w:type="table" w:styleId="114">
+  <w:style w:type="table" w:styleId="115">
     <w:name w:val="Colorful Shading Accent 3"/>
-    <w:basedOn w:val="32"/>
+    <w:basedOn w:val="33"/>
     <w:qFormat/>
     <w:uiPriority w:val="71"/>
     <w:pPr>
@@ -26714,9 +26959,9 @@
       </w:tcPr>
     </w:tblStylePr>
   </w:style>
-  <w:style w:type="table" w:styleId="115">
+  <w:style w:type="table" w:styleId="116">
     <w:name w:val="Colorful Shading Accent 4"/>
-    <w:basedOn w:val="32"/>
+    <w:basedOn w:val="33"/>
     <w:qFormat/>
     <w:uiPriority w:val="71"/>
     <w:pPr>
@@ -26863,9 +27108,9 @@
       </w:rPr>
     </w:tblStylePr>
   </w:style>
-  <w:style w:type="table" w:styleId="116">
+  <w:style w:type="table" w:styleId="117">
     <w:name w:val="Colorful Shading Accent 5"/>
-    <w:basedOn w:val="32"/>
+    <w:basedOn w:val="33"/>
     <w:qFormat/>
     <w:uiPriority w:val="71"/>
     <w:pPr>
@@ -27012,9 +27257,9 @@
       </w:rPr>
     </w:tblStylePr>
   </w:style>
-  <w:style w:type="table" w:styleId="117">
+  <w:style w:type="table" w:styleId="118">
     <w:name w:val="Colorful Shading Accent 6"/>
-    <w:basedOn w:val="32"/>
+    <w:basedOn w:val="33"/>
     <w:qFormat/>
     <w:uiPriority w:val="71"/>
     <w:pPr>
@@ -27161,9 +27406,9 @@
       </w:rPr>
     </w:tblStylePr>
   </w:style>
-  <w:style w:type="table" w:styleId="118">
+  <w:style w:type="table" w:styleId="119">
     <w:name w:val="Colorful List"/>
-    <w:basedOn w:val="32"/>
+    <w:basedOn w:val="33"/>
     <w:qFormat/>
     <w:uiPriority w:val="72"/>
     <w:pPr>
@@ -27254,9 +27499,9 @@
       </w:tcPr>
     </w:tblStylePr>
   </w:style>
-  <w:style w:type="table" w:styleId="119">
+  <w:style w:type="table" w:styleId="120">
     <w:name w:val="Colorful List Accent 1"/>
-    <w:basedOn w:val="32"/>
+    <w:basedOn w:val="33"/>
     <w:qFormat/>
     <w:uiPriority w:val="72"/>
     <w:pPr>
@@ -27347,9 +27592,9 @@
       </w:tcPr>
     </w:tblStylePr>
   </w:style>
-  <w:style w:type="table" w:styleId="120">
+  <w:style w:type="table" w:styleId="121">
     <w:name w:val="Colorful List Accent 2"/>
-    <w:basedOn w:val="32"/>
+    <w:basedOn w:val="33"/>
     <w:qFormat/>
     <w:uiPriority w:val="72"/>
     <w:pPr>
@@ -27440,9 +27685,9 @@
       </w:tcPr>
     </w:tblStylePr>
   </w:style>
-  <w:style w:type="table" w:styleId="121">
+  <w:style w:type="table" w:styleId="122">
     <w:name w:val="Colorful List Accent 3"/>
-    <w:basedOn w:val="32"/>
+    <w:basedOn w:val="33"/>
     <w:qFormat/>
     <w:uiPriority w:val="72"/>
     <w:pPr>
@@ -27533,9 +27778,9 @@
       </w:tcPr>
     </w:tblStylePr>
   </w:style>
-  <w:style w:type="table" w:styleId="122">
+  <w:style w:type="table" w:styleId="123">
     <w:name w:val="Colorful List Accent 4"/>
-    <w:basedOn w:val="32"/>
+    <w:basedOn w:val="33"/>
     <w:qFormat/>
     <w:uiPriority w:val="72"/>
     <w:pPr>
@@ -27626,9 +27871,9 @@
       </w:tcPr>
     </w:tblStylePr>
   </w:style>
-  <w:style w:type="table" w:styleId="123">
+  <w:style w:type="table" w:styleId="124">
     <w:name w:val="Colorful List Accent 5"/>
-    <w:basedOn w:val="32"/>
+    <w:basedOn w:val="33"/>
     <w:qFormat/>
     <w:uiPriority w:val="72"/>
     <w:pPr>
@@ -27719,9 +27964,9 @@
       </w:tcPr>
     </w:tblStylePr>
   </w:style>
-  <w:style w:type="table" w:styleId="124">
+  <w:style w:type="table" w:styleId="125">
     <w:name w:val="Colorful List Accent 6"/>
-    <w:basedOn w:val="32"/>
+    <w:basedOn w:val="33"/>
     <w:qFormat/>
     <w:uiPriority w:val="72"/>
     <w:pPr>
@@ -27812,9 +28057,9 @@
       </w:tcPr>
     </w:tblStylePr>
   </w:style>
-  <w:style w:type="table" w:styleId="125">
+  <w:style w:type="table" w:styleId="126">
     <w:name w:val="Colorful Grid"/>
-    <w:basedOn w:val="32"/>
+    <w:basedOn w:val="33"/>
     <w:qFormat/>
     <w:uiPriority w:val="73"/>
     <w:pPr>
@@ -27909,9 +28154,9 @@
       </w:tcPr>
     </w:tblStylePr>
   </w:style>
-  <w:style w:type="table" w:styleId="126">
+  <w:style w:type="table" w:styleId="127">
     <w:name w:val="Colorful Grid Accent 1"/>
-    <w:basedOn w:val="32"/>
+    <w:basedOn w:val="33"/>
     <w:qFormat/>
     <w:uiPriority w:val="73"/>
     <w:pPr>
@@ -28006,9 +28251,9 @@
       </w:tcPr>
     </w:tblStylePr>
   </w:style>
-  <w:style w:type="table" w:styleId="127">
+  <w:style w:type="table" w:styleId="128">
     <w:name w:val="Colorful Grid Accent 2"/>
-    <w:basedOn w:val="32"/>
+    <w:basedOn w:val="33"/>
     <w:qFormat/>
     <w:uiPriority w:val="73"/>
     <w:pPr>
@@ -28103,9 +28348,9 @@
       </w:tcPr>
     </w:tblStylePr>
   </w:style>
-  <w:style w:type="table" w:styleId="128">
+  <w:style w:type="table" w:styleId="129">
     <w:name w:val="Colorful Grid Accent 3"/>
-    <w:basedOn w:val="32"/>
+    <w:basedOn w:val="33"/>
     <w:qFormat/>
     <w:uiPriority w:val="73"/>
     <w:pPr>
@@ -28200,9 +28445,9 @@
       </w:tcPr>
     </w:tblStylePr>
   </w:style>
-  <w:style w:type="table" w:styleId="129">
+  <w:style w:type="table" w:styleId="130">
     <w:name w:val="Colorful Grid Accent 4"/>
-    <w:basedOn w:val="32"/>
+    <w:basedOn w:val="33"/>
     <w:qFormat/>
     <w:uiPriority w:val="73"/>
     <w:pPr>
@@ -28297,9 +28542,9 @@
       </w:tcPr>
     </w:tblStylePr>
   </w:style>
-  <w:style w:type="table" w:styleId="130">
+  <w:style w:type="table" w:styleId="131">
     <w:name w:val="Colorful Grid Accent 5"/>
-    <w:basedOn w:val="32"/>
+    <w:basedOn w:val="33"/>
     <w:qFormat/>
     <w:uiPriority w:val="73"/>
     <w:pPr>
@@ -28394,9 +28639,9 @@
       </w:tcPr>
     </w:tblStylePr>
   </w:style>
-  <w:style w:type="table" w:styleId="131">
+  <w:style w:type="table" w:styleId="132">
     <w:name w:val="Colorful Grid Accent 6"/>
-    <w:basedOn w:val="32"/>
+    <w:basedOn w:val="33"/>
     <w:qFormat/>
     <w:uiPriority w:val="73"/>
     <w:pPr>
@@ -28491,9 +28736,9 @@
       </w:tcPr>
     </w:tblStylePr>
   </w:style>
-  <w:style w:type="character" w:styleId="133">
+  <w:style w:type="character" w:styleId="134">
     <w:name w:val="Strong"/>
-    <w:basedOn w:val="132"/>
+    <w:basedOn w:val="133"/>
     <w:qFormat/>
     <w:uiPriority w:val="22"/>
     <w:rPr>
@@ -28501,9 +28746,9 @@
       <w:bCs/>
     </w:rPr>
   </w:style>
-  <w:style w:type="character" w:styleId="134">
+  <w:style w:type="character" w:styleId="135">
     <w:name w:val="Emphasis"/>
-    <w:basedOn w:val="132"/>
+    <w:basedOn w:val="133"/>
     <w:qFormat/>
     <w:uiPriority w:val="20"/>
     <w:rPr>
@@ -28511,21 +28756,21 @@
       <w:iCs/>
     </w:rPr>
   </w:style>
-  <w:style w:type="character" w:customStyle="1" w:styleId="135">
+  <w:style w:type="character" w:customStyle="1" w:styleId="136">
     <w:name w:val="Header Char"/>
-    <w:basedOn w:val="132"/>
+    <w:basedOn w:val="133"/>
     <w:link w:val="25"/>
     <w:qFormat/>
     <w:uiPriority w:val="99"/>
   </w:style>
-  <w:style w:type="character" w:customStyle="1" w:styleId="136">
+  <w:style w:type="character" w:customStyle="1" w:styleId="137">
     <w:name w:val="Footer Char"/>
-    <w:basedOn w:val="132"/>
+    <w:basedOn w:val="133"/>
     <w:link w:val="24"/>
     <w:qFormat/>
     <w:uiPriority w:val="99"/>
   </w:style>
-  <w:style w:type="paragraph" w:styleId="137">
+  <w:style w:type="paragraph" w:styleId="138">
     <w:name w:val="No Spacing"/>
     <w:qFormat/>
     <w:uiPriority w:val="1"/>
@@ -28539,9 +28784,9 @@
       <w:lang w:val="en-US" w:eastAsia="en-US" w:bidi="ar-SA"/>
     </w:rPr>
   </w:style>
-  <w:style w:type="character" w:customStyle="1" w:styleId="138">
+  <w:style w:type="character" w:customStyle="1" w:styleId="139">
     <w:name w:val="Heading 1 Char"/>
-    <w:basedOn w:val="132"/>
+    <w:basedOn w:val="133"/>
     <w:link w:val="3"/>
     <w:qFormat/>
     <w:uiPriority w:val="9"/>
@@ -28554,9 +28799,9 @@
       <w:szCs w:val="28"/>
     </w:rPr>
   </w:style>
-  <w:style w:type="character" w:customStyle="1" w:styleId="139">
+  <w:style w:type="character" w:customStyle="1" w:styleId="140">
     <w:name w:val="Heading 2 Char"/>
-    <w:basedOn w:val="132"/>
+    <w:basedOn w:val="133"/>
     <w:link w:val="4"/>
     <w:qFormat/>
     <w:uiPriority w:val="9"/>
@@ -28574,9 +28819,9 @@
       </w14:textFill>
     </w:rPr>
   </w:style>
-  <w:style w:type="character" w:customStyle="1" w:styleId="140">
+  <w:style w:type="character" w:customStyle="1" w:styleId="141">
     <w:name w:val="Heading 3 Char"/>
-    <w:basedOn w:val="132"/>
+    <w:basedOn w:val="133"/>
     <w:link w:val="5"/>
     <w:qFormat/>
     <w:uiPriority w:val="9"/>
@@ -28592,10 +28837,10 @@
       </w14:textFill>
     </w:rPr>
   </w:style>
-  <w:style w:type="character" w:customStyle="1" w:styleId="141">
+  <w:style w:type="character" w:customStyle="1" w:styleId="142">
     <w:name w:val="Title Char"/>
-    <w:basedOn w:val="132"/>
-    <w:link w:val="31"/>
+    <w:basedOn w:val="133"/>
+    <w:link w:val="32"/>
     <w:qFormat/>
     <w:uiPriority w:val="10"/>
     <w:rPr>
@@ -28607,9 +28852,9 @@
       <w:szCs w:val="52"/>
     </w:rPr>
   </w:style>
-  <w:style w:type="character" w:customStyle="1" w:styleId="142">
+  <w:style w:type="character" w:customStyle="1" w:styleId="143">
     <w:name w:val="Subtitle Char"/>
-    <w:basedOn w:val="132"/>
+    <w:basedOn w:val="133"/>
     <w:link w:val="26"/>
     <w:qFormat/>
     <w:uiPriority w:val="11"/>
@@ -28628,7 +28873,7 @@
       </w14:textFill>
     </w:rPr>
   </w:style>
-  <w:style w:type="paragraph" w:styleId="143">
+  <w:style w:type="paragraph" w:styleId="144">
     <w:name w:val="List Paragraph"/>
     <w:basedOn w:val="1"/>
     <w:qFormat/>
@@ -28638,23 +28883,23 @@
       <w:contextualSpacing/>
     </w:pPr>
   </w:style>
-  <w:style w:type="character" w:customStyle="1" w:styleId="144">
+  <w:style w:type="character" w:customStyle="1" w:styleId="145">
     <w:name w:val="Body Text Char"/>
-    <w:basedOn w:val="132"/>
+    <w:basedOn w:val="133"/>
     <w:link w:val="19"/>
     <w:qFormat/>
     <w:uiPriority w:val="99"/>
   </w:style>
-  <w:style w:type="character" w:customStyle="1" w:styleId="145">
+  <w:style w:type="character" w:customStyle="1" w:styleId="146">
     <w:name w:val="Body Text 2 Char"/>
-    <w:basedOn w:val="132"/>
+    <w:basedOn w:val="133"/>
     <w:link w:val="28"/>
     <w:qFormat/>
     <w:uiPriority w:val="99"/>
   </w:style>
-  <w:style w:type="character" w:customStyle="1" w:styleId="146">
+  <w:style w:type="character" w:customStyle="1" w:styleId="147">
     <w:name w:val="Body Text 3 Char"/>
-    <w:basedOn w:val="132"/>
+    <w:basedOn w:val="133"/>
     <w:link w:val="17"/>
     <w:qFormat/>
     <w:uiPriority w:val="99"/>
@@ -28663,9 +28908,9 @@
       <w:szCs w:val="16"/>
     </w:rPr>
   </w:style>
-  <w:style w:type="character" w:customStyle="1" w:styleId="147">
+  <w:style w:type="character" w:customStyle="1" w:styleId="148">
     <w:name w:val="Macro Text Char"/>
-    <w:basedOn w:val="132"/>
+    <w:basedOn w:val="133"/>
     <w:link w:val="2"/>
     <w:qFormat/>
     <w:uiPriority w:val="99"/>
@@ -28675,10 +28920,27 @@
       <w:szCs w:val="20"/>
     </w:rPr>
   </w:style>
-  <w:style w:type="paragraph" w:styleId="148">
+  <w:style w:type="paragraph" w:styleId="149">
     <w:name w:val="Quote"/>
     <w:basedOn w:val="1"/>
     <w:next w:val="1"/>
+    <w:link w:val="150"/>
+    <w:qFormat/>
+    <w:uiPriority w:val="29"/>
+    <w:rPr>
+      <w:i/>
+      <w:iCs/>
+      <w:color w:val="000000" w:themeColor="text1"/>
+      <w14:textFill>
+        <w14:solidFill>
+          <w14:schemeClr w14:val="tx1"/>
+        </w14:solidFill>
+      </w14:textFill>
+    </w:rPr>
+  </w:style>
+  <w:style w:type="character" w:customStyle="1" w:styleId="150">
+    <w:name w:val="Quote Char"/>
+    <w:basedOn w:val="133"/>
     <w:link w:val="149"/>
     <w:qFormat/>
     <w:uiPriority w:val="29"/>
@@ -28693,26 +28955,9 @@
       </w14:textFill>
     </w:rPr>
   </w:style>
-  <w:style w:type="character" w:customStyle="1" w:styleId="149">
-    <w:name w:val="Quote Char"/>
-    <w:basedOn w:val="132"/>
-    <w:link w:val="148"/>
-    <w:qFormat/>
-    <w:uiPriority w:val="29"/>
-    <w:rPr>
-      <w:i/>
-      <w:iCs/>
-      <w:color w:val="000000" w:themeColor="text1"/>
-      <w14:textFill>
-        <w14:solidFill>
-          <w14:schemeClr w14:val="tx1"/>
-        </w14:solidFill>
-      </w14:textFill>
-    </w:rPr>
-  </w:style>
-  <w:style w:type="character" w:customStyle="1" w:styleId="150">
+  <w:style w:type="character" w:customStyle="1" w:styleId="151">
     <w:name w:val="Heading 4 Char"/>
-    <w:basedOn w:val="132"/>
+    <w:basedOn w:val="133"/>
     <w:link w:val="6"/>
     <w:semiHidden/>
     <w:qFormat/>
@@ -28731,9 +28976,9 @@
       </w14:textFill>
     </w:rPr>
   </w:style>
-  <w:style w:type="character" w:customStyle="1" w:styleId="151">
+  <w:style w:type="character" w:customStyle="1" w:styleId="152">
     <w:name w:val="Heading 5 Char"/>
-    <w:basedOn w:val="132"/>
+    <w:basedOn w:val="133"/>
     <w:link w:val="7"/>
     <w:semiHidden/>
     <w:qFormat/>
@@ -28743,9 +28988,9 @@
       <w:color w:val="254061" w:themeColor="accent1" w:themeShade="80"/>
     </w:rPr>
   </w:style>
-  <w:style w:type="character" w:customStyle="1" w:styleId="152">
+  <w:style w:type="character" w:customStyle="1" w:styleId="153">
     <w:name w:val="Heading 6 Char"/>
-    <w:basedOn w:val="132"/>
+    <w:basedOn w:val="133"/>
     <w:link w:val="8"/>
     <w:semiHidden/>
     <w:qFormat/>
@@ -28757,9 +29002,9 @@
       <w:color w:val="254061" w:themeColor="accent1" w:themeShade="80"/>
     </w:rPr>
   </w:style>
-  <w:style w:type="character" w:customStyle="1" w:styleId="153">
+  <w:style w:type="character" w:customStyle="1" w:styleId="154">
     <w:name w:val="Heading 7 Char"/>
-    <w:basedOn w:val="132"/>
+    <w:basedOn w:val="133"/>
     <w:link w:val="9"/>
     <w:semiHidden/>
     <w:qFormat/>
@@ -28779,9 +29024,9 @@
       </w14:textFill>
     </w:rPr>
   </w:style>
-  <w:style w:type="character" w:customStyle="1" w:styleId="154">
+  <w:style w:type="character" w:customStyle="1" w:styleId="155">
     <w:name w:val="Heading 8 Char"/>
-    <w:basedOn w:val="132"/>
+    <w:basedOn w:val="133"/>
     <w:link w:val="10"/>
     <w:semiHidden/>
     <w:qFormat/>
@@ -28798,9 +29043,9 @@
       </w14:textFill>
     </w:rPr>
   </w:style>
-  <w:style w:type="character" w:customStyle="1" w:styleId="155">
+  <w:style w:type="character" w:customStyle="1" w:styleId="156">
     <w:name w:val="Heading 9 Char"/>
-    <w:basedOn w:val="132"/>
+    <w:basedOn w:val="133"/>
     <w:link w:val="11"/>
     <w:semiHidden/>
     <w:qFormat/>
@@ -28822,11 +29067,11 @@
       </w14:textFill>
     </w:rPr>
   </w:style>
-  <w:style w:type="paragraph" w:styleId="156">
+  <w:style w:type="paragraph" w:styleId="157">
     <w:name w:val="Intense Quote"/>
     <w:basedOn w:val="1"/>
     <w:next w:val="1"/>
-    <w:link w:val="157"/>
+    <w:link w:val="158"/>
     <w:qFormat/>
     <w:uiPriority w:val="30"/>
     <w:pPr>
@@ -28849,10 +29094,10 @@
       </w14:textFill>
     </w:rPr>
   </w:style>
-  <w:style w:type="character" w:customStyle="1" w:styleId="157">
+  <w:style w:type="character" w:customStyle="1" w:styleId="158">
     <w:name w:val="Intense Quote Char"/>
-    <w:basedOn w:val="132"/>
-    <w:link w:val="156"/>
+    <w:basedOn w:val="133"/>
+    <w:link w:val="157"/>
     <w:qFormat/>
     <w:uiPriority w:val="30"/>
     <w:rPr>
@@ -28868,9 +29113,9 @@
       </w14:textFill>
     </w:rPr>
   </w:style>
-  <w:style w:type="character" w:customStyle="1" w:styleId="158">
+  <w:style w:type="character" w:customStyle="1" w:styleId="159">
     <w:name w:val="Subtle Emphasis"/>
-    <w:basedOn w:val="132"/>
+    <w:basedOn w:val="133"/>
     <w:qFormat/>
     <w:uiPriority w:val="19"/>
     <w:rPr>
@@ -28887,9 +29132,9 @@
       </w14:textFill>
     </w:rPr>
   </w:style>
-  <w:style w:type="character" w:customStyle="1" w:styleId="159">
+  <w:style w:type="character" w:customStyle="1" w:styleId="160">
     <w:name w:val="Intense Emphasis"/>
-    <w:basedOn w:val="132"/>
+    <w:basedOn w:val="133"/>
     <w:qFormat/>
     <w:uiPriority w:val="21"/>
     <w:rPr>
@@ -28905,9 +29150,9 @@
       </w14:textFill>
     </w:rPr>
   </w:style>
-  <w:style w:type="character" w:customStyle="1" w:styleId="160">
+  <w:style w:type="character" w:customStyle="1" w:styleId="161">
     <w:name w:val="Subtle Reference"/>
-    <w:basedOn w:val="132"/>
+    <w:basedOn w:val="133"/>
     <w:qFormat/>
     <w:uiPriority w:val="31"/>
     <w:rPr>
@@ -28921,9 +29166,9 @@
       </w14:textFill>
     </w:rPr>
   </w:style>
-  <w:style w:type="character" w:customStyle="1" w:styleId="161">
+  <w:style w:type="character" w:customStyle="1" w:styleId="162">
     <w:name w:val="Intense Reference"/>
-    <w:basedOn w:val="132"/>
+    <w:basedOn w:val="133"/>
     <w:qFormat/>
     <w:uiPriority w:val="32"/>
     <w:rPr>
@@ -28940,9 +29185,9 @@
       </w14:textFill>
     </w:rPr>
   </w:style>
-  <w:style w:type="character" w:customStyle="1" w:styleId="162">
+  <w:style w:type="character" w:customStyle="1" w:styleId="163">
     <w:name w:val="Book Title"/>
-    <w:basedOn w:val="132"/>
+    <w:basedOn w:val="133"/>
     <w:qFormat/>
     <w:uiPriority w:val="33"/>
     <w:rPr>
@@ -28952,7 +29197,7 @@
       <w:spacing w:val="5"/>
     </w:rPr>
   </w:style>
-  <w:style w:type="paragraph" w:customStyle="1" w:styleId="163">
+  <w:style w:type="paragraph" w:customStyle="1" w:styleId="164">
     <w:name w:val="TOC Heading"/>
     <w:basedOn w:val="3"/>
     <w:next w:val="1"/>
@@ -28964,7 +29209,7 @@
       <w:outlineLvl w:val="9"/>
     </w:pPr>
   </w:style>
-  <w:style w:type="paragraph" w:customStyle="1" w:styleId="164">
+  <w:style w:type="paragraph" w:customStyle="1" w:styleId="165">
     <w:name w:val="Formula"/>
     <w:uiPriority w:val="0"/>
     <w:pPr>
@@ -29302,7 +29547,7 @@
 </file>
 
 <file path=customXml/item1.xml><?xml version="1.0" encoding="utf-8"?>
-<b:Sources xmlns:b="http://schemas.openxmlformats.org/officeDocument/2006/bibliography" xmlns="http://schemas.openxmlformats.org/officeDocument/2006/bibliography" SelectedStyle="/APA.XSL" StyleName="APA"/>
+<b:Sources xmlns:b="http://schemas.openxmlformats.org/officeDocument/2006/bibliography" xmlns="http://schemas.openxmlformats.org/officeDocument/2006/bibliography" StyleName="APA" SelectedStyle="/APA.XSL"/>
 </file>
 
 <file path=customXml/itemProps1.xml><?xml version="1.0" encoding="utf-8"?>

</xml_diff>